<commit_message>
Petition: add joint-response circumstances and evidence
Co-Authored-By: Claude Opus 5.5 <noreply@anthropic.com>
Claude-Session: https://claude.ai/code/session_01H9b7FFp3sXnkbpWqGcr2Bw
</commit_message>
<xml_diff>
--- a/수사의뢰_진정서.docx
+++ b/수사의뢰_진정서.docx
@@ -1470,7 +1470,25 @@
           <w:sz w:val="22"/>
           <w:szCs w:val="22"/>
         </w:rPr>
-        <w:t xml:space="preserve">진정인은 2026. 9. 15.경 순정축협과 위원회에 자료 공개를 요구하는 내용증명을 각각 보냈습니다. 그러나 위원회는 이를 거부하며 "순정축협에 확인하라"고 하였고, 순정축협은 진정인이 수령권자가 아니라며 공개하지 않았습니다. 두 답변서는 하루 간격으로 같은 우체국에서 연속된 번호로 발송되었고, 맺음말과 구성이 사실상 동일합니다. 진정인은 2026. 10. ____. 위원회에 재차 자료 공개를 요구하였으나 [답변 없음 / 거부] 상태입니다.</w:t>
+        <w:t xml:space="preserve">진정인은 2026. 9. 15.경 순정축협과 위원회에 자료 공개를 요구하는 내용증명을 각각 보냈습니다. 그러나 두 단체 모두 이를 거부하였습니다. 진정인은 2026. 10. ____. 위원회에 재차 자료 공개를 요구하였으나 [답변 없음 / 거부] 상태입니다. 두 단체의 거부는 아래 5항과 같이 </w:t>
+      </w:r>
+      <w:r>
+        <w:rPr>
+          <w:rFonts w:ascii="맑은 고딕" w:cs="맑은 고딕" w:eastAsia="맑은 고딕" w:hAnsi="맑은 고딕"/>
+          <w:b/>
+          <w:bCs/>
+          <w:sz w:val="22"/>
+          <w:szCs w:val="22"/>
+        </w:rPr>
+        <w:t xml:space="preserve">사전에 조율된 공동 대응</w:t>
+      </w:r>
+      <w:r>
+        <w:rPr>
+          <w:rFonts w:ascii="맑은 고딕" w:cs="맑은 고딕" w:eastAsia="맑은 고딕" w:hAnsi="맑은 고딕"/>
+          <w:sz w:val="22"/>
+          <w:szCs w:val="22"/>
+        </w:rPr>
+        <w:t xml:space="preserve">으로 볼 만한 정황이 있습니다.</w:t>
       </w:r>
     </w:p>
     <w:p>
@@ -1486,8 +1504,1820 @@
           <w:sz w:val="24"/>
           <w:szCs w:val="24"/>
         </w:rPr>
-        <w:t xml:space="preserve">5. 수사 요청 사항</w:t>
-      </w:r>
+        <w:t xml:space="preserve">5. 순정축협과 위원회의 공동 대응 정황</w:t>
+      </w:r>
+    </w:p>
+    <w:p>
+      <w:pPr>
+        <w:spacing w:after="120" w:before="0" w:line="380"/>
+        <w:jc w:val="both"/>
+      </w:pPr>
+      <w:r>
+        <w:rPr>
+          <w:rFonts w:ascii="맑은 고딕" w:cs="맑은 고딕" w:eastAsia="맑은 고딕" w:hAnsi="맑은 고딕"/>
+          <w:sz w:val="22"/>
+          <w:szCs w:val="22"/>
+        </w:rPr>
+        <w:t xml:space="preserve">진정인은 위원회의 2026. 9. 21.자 답변서(증 제5호)와 순정축협의 2026. 9. 22.자 답변서(증 제6호)를 대조하였습니다(증 제9호). 그 결과 금원을 지급한 쪽과 받은 쪽이 독자적으로 작성하였다고 보기 어려운 다음과 같은 정황을 확인하였습니다.</w:t>
+      </w:r>
+    </w:p>
+    <w:tbl>
+      <w:tblPr>
+        <w:tblW w:type="dxa" w:w="9638"/>
+        <w:tblBorders>
+          <w:top w:val="single" w:color="auto" w:sz="4"/>
+          <w:left w:val="single" w:color="auto" w:sz="4"/>
+          <w:bottom w:val="single" w:color="auto" w:sz="4"/>
+          <w:right w:val="single" w:color="auto" w:sz="4"/>
+          <w:insideH w:val="single" w:color="auto" w:sz="4"/>
+          <w:insideV w:val="single" w:color="auto" w:sz="4"/>
+        </w:tblBorders>
+      </w:tblPr>
+      <w:tblGrid>
+        <w:gridCol w:w="600"/>
+        <w:gridCol w:w="1900"/>
+        <w:gridCol w:w="3569"/>
+        <w:gridCol w:w="3569"/>
+      </w:tblGrid>
+      <w:tr>
+        <w:trPr>
+          <w:cantSplit/>
+          <w:tblHeader/>
+        </w:trPr>
+        <w:tc>
+          <w:tcPr>
+            <w:tcW w:type="dxa" w:w="600"/>
+            <w:tcBorders>
+              <w:top w:val="single" w:color="808080" w:sz="4"/>
+              <w:left w:val="single" w:color="808080" w:sz="4"/>
+              <w:bottom w:val="single" w:color="808080" w:sz="4"/>
+              <w:right w:val="single" w:color="808080" w:sz="4"/>
+            </w:tcBorders>
+            <w:shd w:fill="E7E9EC" w:color="auto" w:val="clear"/>
+            <w:tcMar>
+              <w:top w:type="dxa" w:w="80"/>
+              <w:left w:type="dxa" w:w="110"/>
+              <w:bottom w:type="dxa" w:w="80"/>
+              <w:right w:type="dxa" w:w="110"/>
+            </w:tcMar>
+            <w:vAlign w:val="center"/>
+          </w:tcPr>
+          <w:p>
+            <w:pPr>
+              <w:spacing w:line="320"/>
+              <w:jc w:val="center"/>
+            </w:pPr>
+            <w:r>
+              <w:rPr>
+                <w:rFonts w:ascii="맑은 고딕" w:cs="맑은 고딕" w:eastAsia="맑은 고딕" w:hAnsi="맑은 고딕"/>
+                <w:b/>
+                <w:bCs/>
+                <w:sz w:val="20"/>
+                <w:szCs w:val="20"/>
+              </w:rPr>
+              <w:t xml:space="preserve">번호</w:t>
+            </w:r>
+          </w:p>
+        </w:tc>
+        <w:tc>
+          <w:tcPr>
+            <w:tcW w:type="dxa" w:w="1900"/>
+            <w:tcBorders>
+              <w:top w:val="single" w:color="808080" w:sz="4"/>
+              <w:left w:val="single" w:color="808080" w:sz="4"/>
+              <w:bottom w:val="single" w:color="808080" w:sz="4"/>
+              <w:right w:val="single" w:color="808080" w:sz="4"/>
+            </w:tcBorders>
+            <w:shd w:fill="E7E9EC" w:color="auto" w:val="clear"/>
+            <w:tcMar>
+              <w:top w:type="dxa" w:w="80"/>
+              <w:left w:type="dxa" w:w="110"/>
+              <w:bottom w:type="dxa" w:w="80"/>
+              <w:right w:type="dxa" w:w="110"/>
+            </w:tcMar>
+            <w:vAlign w:val="center"/>
+          </w:tcPr>
+          <w:p>
+            <w:pPr>
+              <w:spacing w:line="320"/>
+              <w:jc w:val="center"/>
+            </w:pPr>
+            <w:r>
+              <w:rPr>
+                <w:rFonts w:ascii="맑은 고딕" w:cs="맑은 고딕" w:eastAsia="맑은 고딕" w:hAnsi="맑은 고딕"/>
+                <w:b/>
+                <w:bCs/>
+                <w:sz w:val="20"/>
+                <w:szCs w:val="20"/>
+              </w:rPr>
+              <w:t xml:space="preserve">구분</w:t>
+            </w:r>
+          </w:p>
+        </w:tc>
+        <w:tc>
+          <w:tcPr>
+            <w:tcW w:type="dxa" w:w="3569"/>
+            <w:tcBorders>
+              <w:top w:val="single" w:color="808080" w:sz="4"/>
+              <w:left w:val="single" w:color="808080" w:sz="4"/>
+              <w:bottom w:val="single" w:color="808080" w:sz="4"/>
+              <w:right w:val="single" w:color="808080" w:sz="4"/>
+            </w:tcBorders>
+            <w:shd w:fill="E7E9EC" w:color="auto" w:val="clear"/>
+            <w:tcMar>
+              <w:top w:type="dxa" w:w="80"/>
+              <w:left w:type="dxa" w:w="110"/>
+              <w:bottom w:type="dxa" w:w="80"/>
+              <w:right w:type="dxa" w:w="110"/>
+            </w:tcMar>
+            <w:vAlign w:val="center"/>
+          </w:tcPr>
+          <w:p>
+            <w:pPr>
+              <w:spacing w:line="320"/>
+              <w:jc w:val="center"/>
+            </w:pPr>
+            <w:r>
+              <w:rPr>
+                <w:rFonts w:ascii="맑은 고딕" w:cs="맑은 고딕" w:eastAsia="맑은 고딕" w:hAnsi="맑은 고딕"/>
+                <w:b/>
+                <w:bCs/>
+                <w:sz w:val="20"/>
+                <w:szCs w:val="20"/>
+              </w:rPr>
+              <w:t xml:space="preserve">위원회 답변서 (2026. 9. 21.)</w:t>
+            </w:r>
+          </w:p>
+        </w:tc>
+        <w:tc>
+          <w:tcPr>
+            <w:tcW w:type="dxa" w:w="3569"/>
+            <w:tcBorders>
+              <w:top w:val="single" w:color="808080" w:sz="4"/>
+              <w:left w:val="single" w:color="808080" w:sz="4"/>
+              <w:bottom w:val="single" w:color="808080" w:sz="4"/>
+              <w:right w:val="single" w:color="808080" w:sz="4"/>
+            </w:tcBorders>
+            <w:shd w:fill="E7E9EC" w:color="auto" w:val="clear"/>
+            <w:tcMar>
+              <w:top w:type="dxa" w:w="80"/>
+              <w:left w:type="dxa" w:w="110"/>
+              <w:bottom w:type="dxa" w:w="80"/>
+              <w:right w:type="dxa" w:w="110"/>
+            </w:tcMar>
+            <w:vAlign w:val="center"/>
+          </w:tcPr>
+          <w:p>
+            <w:pPr>
+              <w:spacing w:line="320"/>
+              <w:jc w:val="center"/>
+            </w:pPr>
+            <w:r>
+              <w:rPr>
+                <w:rFonts w:ascii="맑은 고딕" w:cs="맑은 고딕" w:eastAsia="맑은 고딕" w:hAnsi="맑은 고딕"/>
+                <w:b/>
+                <w:bCs/>
+                <w:sz w:val="20"/>
+                <w:szCs w:val="20"/>
+              </w:rPr>
+              <w:t xml:space="preserve">순정축협 답변서 (2026. 9. 22.)</w:t>
+            </w:r>
+          </w:p>
+        </w:tc>
+      </w:tr>
+      <w:tr>
+        <w:trPr>
+          <w:cantSplit/>
+          <w:tblHeader w:val="off"/>
+        </w:trPr>
+        <w:tc>
+          <w:tcPr>
+            <w:tcW w:type="dxa" w:w="600"/>
+            <w:tcBorders>
+              <w:top w:val="single" w:color="808080" w:sz="4"/>
+              <w:left w:val="single" w:color="808080" w:sz="4"/>
+              <w:bottom w:val="single" w:color="808080" w:sz="4"/>
+              <w:right w:val="single" w:color="808080" w:sz="4"/>
+            </w:tcBorders>
+            <w:tcMar>
+              <w:top w:type="dxa" w:w="80"/>
+              <w:left w:type="dxa" w:w="110"/>
+              <w:bottom w:type="dxa" w:w="80"/>
+              <w:right w:type="dxa" w:w="110"/>
+            </w:tcMar>
+            <w:vAlign w:val="center"/>
+          </w:tcPr>
+          <w:p>
+            <w:pPr>
+              <w:spacing w:line="320"/>
+              <w:jc w:val="left"/>
+            </w:pPr>
+            <w:r>
+              <w:rPr>
+                <w:rFonts w:ascii="맑은 고딕" w:cs="맑은 고딕" w:eastAsia="맑은 고딕" w:hAnsi="맑은 고딕"/>
+                <w:b w:val="false"/>
+                <w:bCs w:val="false"/>
+                <w:sz w:val="20"/>
+                <w:szCs w:val="20"/>
+              </w:rPr>
+              <w:t xml:space="preserve">1</w:t>
+            </w:r>
+          </w:p>
+        </w:tc>
+        <w:tc>
+          <w:tcPr>
+            <w:tcW w:type="dxa" w:w="1900"/>
+            <w:tcBorders>
+              <w:top w:val="single" w:color="808080" w:sz="4"/>
+              <w:left w:val="single" w:color="808080" w:sz="4"/>
+              <w:bottom w:val="single" w:color="808080" w:sz="4"/>
+              <w:right w:val="single" w:color="808080" w:sz="4"/>
+            </w:tcBorders>
+            <w:tcMar>
+              <w:top w:type="dxa" w:w="80"/>
+              <w:left w:type="dxa" w:w="110"/>
+              <w:bottom w:type="dxa" w:w="80"/>
+              <w:right w:type="dxa" w:w="110"/>
+            </w:tcMar>
+            <w:vAlign w:val="center"/>
+          </w:tcPr>
+          <w:p>
+            <w:pPr>
+              <w:spacing w:line="320"/>
+              <w:jc w:val="left"/>
+            </w:pPr>
+            <w:r>
+              <w:rPr>
+                <w:rFonts w:ascii="맑은 고딕" w:cs="맑은 고딕" w:eastAsia="맑은 고딕" w:hAnsi="맑은 고딕"/>
+                <w:b w:val="false"/>
+                <w:bCs w:val="false"/>
+                <w:sz w:val="20"/>
+                <w:szCs w:val="20"/>
+              </w:rPr>
+              <w:t xml:space="preserve">발송</w:t>
+            </w:r>
+          </w:p>
+        </w:tc>
+        <w:tc>
+          <w:tcPr>
+            <w:tcW w:type="dxa" w:w="3569"/>
+            <w:tcBorders>
+              <w:top w:val="single" w:color="808080" w:sz="4"/>
+              <w:left w:val="single" w:color="808080" w:sz="4"/>
+              <w:bottom w:val="single" w:color="808080" w:sz="4"/>
+              <w:right w:val="single" w:color="808080" w:sz="4"/>
+            </w:tcBorders>
+            <w:tcMar>
+              <w:top w:type="dxa" w:w="80"/>
+              <w:left w:type="dxa" w:w="110"/>
+              <w:bottom w:type="dxa" w:w="80"/>
+              <w:right w:type="dxa" w:w="110"/>
+            </w:tcMar>
+            <w:vAlign w:val="center"/>
+          </w:tcPr>
+          <w:p>
+            <w:pPr>
+              <w:spacing w:line="320"/>
+              <w:jc w:val="left"/>
+            </w:pPr>
+            <w:r>
+              <w:rPr>
+                <w:rFonts w:ascii="맑은 고딕" w:cs="맑은 고딕" w:eastAsia="맑은 고딕" w:hAnsi="맑은 고딕"/>
+                <w:b w:val="false"/>
+                <w:bCs w:val="false"/>
+                <w:sz w:val="20"/>
+                <w:szCs w:val="20"/>
+              </w:rPr>
+              <w:t xml:space="preserve">정읍감곡우편취급국 제3590303000</w:t>
+            </w:r>
+            <w:r>
+              <w:rPr>
+                <w:rFonts w:ascii="맑은 고딕" w:cs="맑은 고딕" w:eastAsia="맑은 고딕" w:hAnsi="맑은 고딕"/>
+                <w:b/>
+                <w:bCs/>
+                <w:sz w:val="20"/>
+                <w:szCs w:val="20"/>
+              </w:rPr>
+              <w:t xml:space="preserve">069</w:t>
+            </w:r>
+            <w:r>
+              <w:rPr>
+                <w:rFonts w:ascii="맑은 고딕" w:cs="맑은 고딕" w:eastAsia="맑은 고딕" w:hAnsi="맑은 고딕"/>
+                <w:b w:val="false"/>
+                <w:bCs w:val="false"/>
+                <w:sz w:val="20"/>
+                <w:szCs w:val="20"/>
+              </w:rPr>
+              <w:t xml:space="preserve">호</w:t>
+            </w:r>
+          </w:p>
+        </w:tc>
+        <w:tc>
+          <w:tcPr>
+            <w:tcW w:type="dxa" w:w="3569"/>
+            <w:tcBorders>
+              <w:top w:val="single" w:color="808080" w:sz="4"/>
+              <w:left w:val="single" w:color="808080" w:sz="4"/>
+              <w:bottom w:val="single" w:color="808080" w:sz="4"/>
+              <w:right w:val="single" w:color="808080" w:sz="4"/>
+            </w:tcBorders>
+            <w:tcMar>
+              <w:top w:type="dxa" w:w="80"/>
+              <w:left w:type="dxa" w:w="110"/>
+              <w:bottom w:type="dxa" w:w="80"/>
+              <w:right w:type="dxa" w:w="110"/>
+            </w:tcMar>
+            <w:vAlign w:val="center"/>
+          </w:tcPr>
+          <w:p>
+            <w:pPr>
+              <w:spacing w:line="320"/>
+              <w:jc w:val="left"/>
+            </w:pPr>
+            <w:r>
+              <w:rPr>
+                <w:rFonts w:ascii="맑은 고딕" w:cs="맑은 고딕" w:eastAsia="맑은 고딕" w:hAnsi="맑은 고딕"/>
+                <w:b w:val="false"/>
+                <w:bCs w:val="false"/>
+                <w:sz w:val="20"/>
+                <w:szCs w:val="20"/>
+              </w:rPr>
+              <w:t xml:space="preserve">같은 우체국 제3590303000</w:t>
+            </w:r>
+            <w:r>
+              <w:rPr>
+                <w:rFonts w:ascii="맑은 고딕" w:cs="맑은 고딕" w:eastAsia="맑은 고딕" w:hAnsi="맑은 고딕"/>
+                <w:b/>
+                <w:bCs/>
+                <w:sz w:val="20"/>
+                <w:szCs w:val="20"/>
+              </w:rPr>
+              <w:t xml:space="preserve">070</w:t>
+            </w:r>
+            <w:r>
+              <w:rPr>
+                <w:rFonts w:ascii="맑은 고딕" w:cs="맑은 고딕" w:eastAsia="맑은 고딕" w:hAnsi="맑은 고딕"/>
+                <w:b w:val="false"/>
+                <w:bCs w:val="false"/>
+                <w:sz w:val="20"/>
+                <w:szCs w:val="20"/>
+              </w:rPr>
+              <w:t xml:space="preserve">호 (하루 뒤, 연속 번호)</w:t>
+            </w:r>
+          </w:p>
+        </w:tc>
+      </w:tr>
+      <w:tr>
+        <w:trPr>
+          <w:cantSplit/>
+          <w:tblHeader w:val="off"/>
+        </w:trPr>
+        <w:tc>
+          <w:tcPr>
+            <w:tcW w:type="dxa" w:w="600"/>
+            <w:tcBorders>
+              <w:top w:val="single" w:color="808080" w:sz="4"/>
+              <w:left w:val="single" w:color="808080" w:sz="4"/>
+              <w:bottom w:val="single" w:color="808080" w:sz="4"/>
+              <w:right w:val="single" w:color="808080" w:sz="4"/>
+            </w:tcBorders>
+            <w:tcMar>
+              <w:top w:type="dxa" w:w="80"/>
+              <w:left w:type="dxa" w:w="110"/>
+              <w:bottom w:type="dxa" w:w="80"/>
+              <w:right w:type="dxa" w:w="110"/>
+            </w:tcMar>
+            <w:vAlign w:val="center"/>
+          </w:tcPr>
+          <w:p>
+            <w:pPr>
+              <w:spacing w:line="320"/>
+              <w:jc w:val="left"/>
+            </w:pPr>
+            <w:r>
+              <w:rPr>
+                <w:rFonts w:ascii="맑은 고딕" w:cs="맑은 고딕" w:eastAsia="맑은 고딕" w:hAnsi="맑은 고딕"/>
+                <w:b w:val="false"/>
+                <w:bCs w:val="false"/>
+                <w:sz w:val="20"/>
+                <w:szCs w:val="20"/>
+              </w:rPr>
+              <w:t xml:space="preserve">2</w:t>
+            </w:r>
+          </w:p>
+        </w:tc>
+        <w:tc>
+          <w:tcPr>
+            <w:tcW w:type="dxa" w:w="1900"/>
+            <w:tcBorders>
+              <w:top w:val="single" w:color="808080" w:sz="4"/>
+              <w:left w:val="single" w:color="808080" w:sz="4"/>
+              <w:bottom w:val="single" w:color="808080" w:sz="4"/>
+              <w:right w:val="single" w:color="808080" w:sz="4"/>
+            </w:tcBorders>
+            <w:tcMar>
+              <w:top w:type="dxa" w:w="80"/>
+              <w:left w:type="dxa" w:w="110"/>
+              <w:bottom w:type="dxa" w:w="80"/>
+              <w:right w:type="dxa" w:w="110"/>
+            </w:tcMar>
+            <w:vAlign w:val="center"/>
+          </w:tcPr>
+          <w:p>
+            <w:pPr>
+              <w:spacing w:line="320"/>
+              <w:jc w:val="left"/>
+            </w:pPr>
+            <w:r>
+              <w:rPr>
+                <w:rFonts w:ascii="맑은 고딕" w:cs="맑은 고딕" w:eastAsia="맑은 고딕" w:hAnsi="맑은 고딕"/>
+                <w:b w:val="false"/>
+                <w:bCs w:val="false"/>
+                <w:sz w:val="20"/>
+                <w:szCs w:val="20"/>
+              </w:rPr>
+              <w:t xml:space="preserve">위원회의 성격 규정</w:t>
+            </w:r>
+          </w:p>
+        </w:tc>
+        <w:tc>
+          <w:tcPr>
+            <w:tcW w:type="dxa" w:w="3569"/>
+            <w:tcBorders>
+              <w:top w:val="single" w:color="808080" w:sz="4"/>
+              <w:left w:val="single" w:color="808080" w:sz="4"/>
+              <w:bottom w:val="single" w:color="808080" w:sz="4"/>
+              <w:right w:val="single" w:color="808080" w:sz="4"/>
+            </w:tcBorders>
+            <w:tcMar>
+              <w:top w:type="dxa" w:w="80"/>
+              <w:left w:type="dxa" w:w="110"/>
+              <w:bottom w:type="dxa" w:w="80"/>
+              <w:right w:type="dxa" w:w="110"/>
+            </w:tcMar>
+            <w:vAlign w:val="center"/>
+          </w:tcPr>
+          <w:p>
+            <w:pPr>
+              <w:spacing w:line="320"/>
+              <w:jc w:val="left"/>
+            </w:pPr>
+            <w:r>
+              <w:rPr>
+                <w:rFonts w:ascii="맑은 고딕" w:cs="맑은 고딕" w:eastAsia="맑은 고딕" w:hAnsi="맑은 고딕"/>
+                <w:b w:val="false"/>
+                <w:bCs w:val="false"/>
+                <w:sz w:val="20"/>
+                <w:szCs w:val="20"/>
+              </w:rPr>
+              <w:t xml:space="preserve">"지역 환경개선이라는 공동의 목적에 뜻을 함께하는 </w:t>
+            </w:r>
+            <w:r>
+              <w:rPr>
+                <w:rFonts w:ascii="맑은 고딕" w:cs="맑은 고딕" w:eastAsia="맑은 고딕" w:hAnsi="맑은 고딕"/>
+                <w:b/>
+                <w:bCs/>
+                <w:sz w:val="20"/>
+                <w:szCs w:val="20"/>
+              </w:rPr>
+              <w:t xml:space="preserve">주민들이 자발적으로 구성한 민간 공동체</w:t>
+            </w:r>
+            <w:r>
+              <w:rPr>
+                <w:rFonts w:ascii="맑은 고딕" w:cs="맑은 고딕" w:eastAsia="맑은 고딕" w:hAnsi="맑은 고딕"/>
+                <w:b w:val="false"/>
+                <w:bCs w:val="false"/>
+                <w:sz w:val="20"/>
+                <w:szCs w:val="20"/>
+              </w:rPr>
+              <w:t xml:space="preserve">"</w:t>
+            </w:r>
+          </w:p>
+        </w:tc>
+        <w:tc>
+          <w:tcPr>
+            <w:tcW w:type="dxa" w:w="3569"/>
+            <w:tcBorders>
+              <w:top w:val="single" w:color="808080" w:sz="4"/>
+              <w:left w:val="single" w:color="808080" w:sz="4"/>
+              <w:bottom w:val="single" w:color="808080" w:sz="4"/>
+              <w:right w:val="single" w:color="808080" w:sz="4"/>
+            </w:tcBorders>
+            <w:tcMar>
+              <w:top w:type="dxa" w:w="80"/>
+              <w:left w:type="dxa" w:w="110"/>
+              <w:bottom w:type="dxa" w:w="80"/>
+              <w:right w:type="dxa" w:w="110"/>
+            </w:tcMar>
+            <w:vAlign w:val="center"/>
+          </w:tcPr>
+          <w:p>
+            <w:pPr>
+              <w:spacing w:line="320"/>
+              <w:jc w:val="left"/>
+            </w:pPr>
+            <w:r>
+              <w:rPr>
+                <w:rFonts w:ascii="맑은 고딕" w:cs="맑은 고딕" w:eastAsia="맑은 고딕" w:hAnsi="맑은 고딕"/>
+                <w:b w:val="false"/>
+                <w:bCs w:val="false"/>
+                <w:sz w:val="20"/>
+                <w:szCs w:val="20"/>
+              </w:rPr>
+              <w:t xml:space="preserve">"환경 문제에 관심을 가진 주민들과 자연가 송완복 이사장 등이 </w:t>
+            </w:r>
+            <w:r>
+              <w:rPr>
+                <w:rFonts w:ascii="맑은 고딕" w:cs="맑은 고딕" w:eastAsia="맑은 고딕" w:hAnsi="맑은 고딕"/>
+                <w:b/>
+                <w:bCs/>
+                <w:sz w:val="20"/>
+                <w:szCs w:val="20"/>
+              </w:rPr>
+              <w:t xml:space="preserve">자발적으로 참여</w:t>
+            </w:r>
+            <w:r>
+              <w:rPr>
+                <w:rFonts w:ascii="맑은 고딕" w:cs="맑은 고딕" w:eastAsia="맑은 고딕" w:hAnsi="맑은 고딕"/>
+                <w:b w:val="false"/>
+                <w:bCs w:val="false"/>
+                <w:sz w:val="20"/>
+                <w:szCs w:val="20"/>
+              </w:rPr>
+              <w:t xml:space="preserve">하여 … 구성한 </w:t>
+            </w:r>
+            <w:r>
+              <w:rPr>
+                <w:rFonts w:ascii="맑은 고딕" w:cs="맑은 고딕" w:eastAsia="맑은 고딕" w:hAnsi="맑은 고딕"/>
+                <w:b/>
+                <w:bCs/>
+                <w:sz w:val="20"/>
+                <w:szCs w:val="20"/>
+              </w:rPr>
+              <w:t xml:space="preserve">주민공동체</w:t>
+            </w:r>
+            <w:r>
+              <w:rPr>
+                <w:rFonts w:ascii="맑은 고딕" w:cs="맑은 고딕" w:eastAsia="맑은 고딕" w:hAnsi="맑은 고딕"/>
+                <w:b w:val="false"/>
+                <w:bCs w:val="false"/>
+                <w:sz w:val="20"/>
+                <w:szCs w:val="20"/>
+              </w:rPr>
+              <w:t xml:space="preserve">"</w:t>
+            </w:r>
+          </w:p>
+        </w:tc>
+      </w:tr>
+      <w:tr>
+        <w:trPr>
+          <w:cantSplit/>
+          <w:tblHeader w:val="off"/>
+        </w:trPr>
+        <w:tc>
+          <w:tcPr>
+            <w:tcW w:type="dxa" w:w="600"/>
+            <w:tcBorders>
+              <w:top w:val="single" w:color="808080" w:sz="4"/>
+              <w:left w:val="single" w:color="808080" w:sz="4"/>
+              <w:bottom w:val="single" w:color="808080" w:sz="4"/>
+              <w:right w:val="single" w:color="808080" w:sz="4"/>
+            </w:tcBorders>
+            <w:tcMar>
+              <w:top w:type="dxa" w:w="80"/>
+              <w:left w:type="dxa" w:w="110"/>
+              <w:bottom w:type="dxa" w:w="80"/>
+              <w:right w:type="dxa" w:w="110"/>
+            </w:tcMar>
+            <w:vAlign w:val="center"/>
+          </w:tcPr>
+          <w:p>
+            <w:pPr>
+              <w:spacing w:line="320"/>
+              <w:jc w:val="left"/>
+            </w:pPr>
+            <w:r>
+              <w:rPr>
+                <w:rFonts w:ascii="맑은 고딕" w:cs="맑은 고딕" w:eastAsia="맑은 고딕" w:hAnsi="맑은 고딕"/>
+                <w:b w:val="false"/>
+                <w:bCs w:val="false"/>
+                <w:sz w:val="20"/>
+                <w:szCs w:val="20"/>
+              </w:rPr>
+              <w:t xml:space="preserve">3</w:t>
+            </w:r>
+          </w:p>
+        </w:tc>
+        <w:tc>
+          <w:tcPr>
+            <w:tcW w:type="dxa" w:w="1900"/>
+            <w:tcBorders>
+              <w:top w:val="single" w:color="808080" w:sz="4"/>
+              <w:left w:val="single" w:color="808080" w:sz="4"/>
+              <w:bottom w:val="single" w:color="808080" w:sz="4"/>
+              <w:right w:val="single" w:color="808080" w:sz="4"/>
+            </w:tcBorders>
+            <w:tcMar>
+              <w:top w:type="dxa" w:w="80"/>
+              <w:left w:type="dxa" w:w="110"/>
+              <w:bottom w:type="dxa" w:w="80"/>
+              <w:right w:type="dxa" w:w="110"/>
+            </w:tcMar>
+            <w:vAlign w:val="center"/>
+          </w:tcPr>
+          <w:p>
+            <w:pPr>
+              <w:spacing w:line="320"/>
+              <w:jc w:val="left"/>
+            </w:pPr>
+            <w:r>
+              <w:rPr>
+                <w:rFonts w:ascii="맑은 고딕" w:cs="맑은 고딕" w:eastAsia="맑은 고딕" w:hAnsi="맑은 고딕"/>
+                <w:b w:val="false"/>
+                <w:bCs w:val="false"/>
+                <w:sz w:val="20"/>
+                <w:szCs w:val="20"/>
+              </w:rPr>
+              <w:t xml:space="preserve">진정인의 자격 부정</w:t>
+            </w:r>
+          </w:p>
+        </w:tc>
+        <w:tc>
+          <w:tcPr>
+            <w:tcW w:type="dxa" w:w="3569"/>
+            <w:tcBorders>
+              <w:top w:val="single" w:color="808080" w:sz="4"/>
+              <w:left w:val="single" w:color="808080" w:sz="4"/>
+              <w:bottom w:val="single" w:color="808080" w:sz="4"/>
+              <w:right w:val="single" w:color="808080" w:sz="4"/>
+            </w:tcBorders>
+            <w:tcMar>
+              <w:top w:type="dxa" w:w="80"/>
+              <w:left w:type="dxa" w:w="110"/>
+              <w:bottom w:type="dxa" w:w="80"/>
+              <w:right w:type="dxa" w:w="110"/>
+            </w:tcMar>
+            <w:vAlign w:val="center"/>
+          </w:tcPr>
+          <w:p>
+            <w:pPr>
+              <w:spacing w:line="320"/>
+              <w:jc w:val="left"/>
+            </w:pPr>
+            <w:r>
+              <w:rPr>
+                <w:rFonts w:ascii="맑은 고딕" w:cs="맑은 고딕" w:eastAsia="맑은 고딕" w:hAnsi="맑은 고딕"/>
+                <w:b w:val="false"/>
+                <w:bCs w:val="false"/>
+                <w:sz w:val="20"/>
+                <w:szCs w:val="20"/>
+              </w:rPr>
+              <w:t xml:space="preserve">"귀하는 … 후원금의 지급이나 수령, 집행 및 관련 협약에 참여한 </w:t>
+            </w:r>
+            <w:r>
+              <w:rPr>
+                <w:rFonts w:ascii="맑은 고딕" w:cs="맑은 고딕" w:eastAsia="맑은 고딕" w:hAnsi="맑은 고딕"/>
+                <w:b/>
+                <w:bCs/>
+                <w:sz w:val="20"/>
+                <w:szCs w:val="20"/>
+              </w:rPr>
+              <w:t xml:space="preserve">당사자도 아닌</w:t>
+            </w:r>
+            <w:r>
+              <w:rPr>
+                <w:rFonts w:ascii="맑은 고딕" w:cs="맑은 고딕" w:eastAsia="맑은 고딕" w:hAnsi="맑은 고딕"/>
+                <w:b w:val="false"/>
+                <w:bCs w:val="false"/>
+                <w:sz w:val="20"/>
+                <w:szCs w:val="20"/>
+              </w:rPr>
+              <w:t xml:space="preserve"> 것으로 확인됩니다"</w:t>
+            </w:r>
+          </w:p>
+        </w:tc>
+        <w:tc>
+          <w:tcPr>
+            <w:tcW w:type="dxa" w:w="3569"/>
+            <w:tcBorders>
+              <w:top w:val="single" w:color="808080" w:sz="4"/>
+              <w:left w:val="single" w:color="808080" w:sz="4"/>
+              <w:bottom w:val="single" w:color="808080" w:sz="4"/>
+              <w:right w:val="single" w:color="808080" w:sz="4"/>
+            </w:tcBorders>
+            <w:tcMar>
+              <w:top w:type="dxa" w:w="80"/>
+              <w:left w:type="dxa" w:w="110"/>
+              <w:bottom w:type="dxa" w:w="80"/>
+              <w:right w:type="dxa" w:w="110"/>
+            </w:tcMar>
+            <w:vAlign w:val="center"/>
+          </w:tcPr>
+          <w:p>
+            <w:pPr>
+              <w:spacing w:line="320"/>
+              <w:jc w:val="left"/>
+            </w:pPr>
+            <w:r>
+              <w:rPr>
+                <w:rFonts w:ascii="맑은 고딕" w:cs="맑은 고딕" w:eastAsia="맑은 고딕" w:hAnsi="맑은 고딕"/>
+                <w:b w:val="false"/>
+                <w:bCs w:val="false"/>
+                <w:sz w:val="20"/>
+                <w:szCs w:val="20"/>
+              </w:rPr>
+              <w:t xml:space="preserve">"귀하는 해당 사업비 지급이나 집행의 </w:t>
+            </w:r>
+            <w:r>
+              <w:rPr>
+                <w:rFonts w:ascii="맑은 고딕" w:cs="맑은 고딕" w:eastAsia="맑은 고딕" w:hAnsi="맑은 고딕"/>
+                <w:b/>
+                <w:bCs/>
+                <w:sz w:val="20"/>
+                <w:szCs w:val="20"/>
+              </w:rPr>
+              <w:t xml:space="preserve">당사자 또는 수령권자가 아니며</w:t>
+            </w:r>
+            <w:r>
+              <w:rPr>
+                <w:rFonts w:ascii="맑은 고딕" w:cs="맑은 고딕" w:eastAsia="맑은 고딕" w:hAnsi="맑은 고딕"/>
+                <w:b w:val="false"/>
+                <w:bCs w:val="false"/>
+                <w:sz w:val="20"/>
+                <w:szCs w:val="20"/>
+              </w:rPr>
+              <w:t xml:space="preserve">"</w:t>
+            </w:r>
+          </w:p>
+        </w:tc>
+      </w:tr>
+      <w:tr>
+        <w:trPr>
+          <w:cantSplit/>
+          <w:tblHeader w:val="off"/>
+        </w:trPr>
+        <w:tc>
+          <w:tcPr>
+            <w:tcW w:type="dxa" w:w="600"/>
+            <w:tcBorders>
+              <w:top w:val="single" w:color="808080" w:sz="4"/>
+              <w:left w:val="single" w:color="808080" w:sz="4"/>
+              <w:bottom w:val="single" w:color="808080" w:sz="4"/>
+              <w:right w:val="single" w:color="808080" w:sz="4"/>
+            </w:tcBorders>
+            <w:tcMar>
+              <w:top w:type="dxa" w:w="80"/>
+              <w:left w:type="dxa" w:w="110"/>
+              <w:bottom w:type="dxa" w:w="80"/>
+              <w:right w:type="dxa" w:w="110"/>
+            </w:tcMar>
+            <w:vAlign w:val="center"/>
+          </w:tcPr>
+          <w:p>
+            <w:pPr>
+              <w:spacing w:line="320"/>
+              <w:jc w:val="left"/>
+            </w:pPr>
+            <w:r>
+              <w:rPr>
+                <w:rFonts w:ascii="맑은 고딕" w:cs="맑은 고딕" w:eastAsia="맑은 고딕" w:hAnsi="맑은 고딕"/>
+                <w:b w:val="false"/>
+                <w:bCs w:val="false"/>
+                <w:sz w:val="20"/>
+                <w:szCs w:val="20"/>
+              </w:rPr>
+              <w:t xml:space="preserve">4</w:t>
+            </w:r>
+          </w:p>
+        </w:tc>
+        <w:tc>
+          <w:tcPr>
+            <w:tcW w:type="dxa" w:w="1900"/>
+            <w:tcBorders>
+              <w:top w:val="single" w:color="808080" w:sz="4"/>
+              <w:left w:val="single" w:color="808080" w:sz="4"/>
+              <w:bottom w:val="single" w:color="808080" w:sz="4"/>
+              <w:right w:val="single" w:color="808080" w:sz="4"/>
+            </w:tcBorders>
+            <w:tcMar>
+              <w:top w:type="dxa" w:w="80"/>
+              <w:left w:type="dxa" w:w="110"/>
+              <w:bottom w:type="dxa" w:w="80"/>
+              <w:right w:type="dxa" w:w="110"/>
+            </w:tcMar>
+            <w:vAlign w:val="center"/>
+          </w:tcPr>
+          <w:p>
+            <w:pPr>
+              <w:spacing w:line="320"/>
+              <w:jc w:val="left"/>
+            </w:pPr>
+            <w:r>
+              <w:rPr>
+                <w:rFonts w:ascii="맑은 고딕" w:cs="맑은 고딕" w:eastAsia="맑은 고딕" w:hAnsi="맑은 고딕"/>
+                <w:b w:val="false"/>
+                <w:bCs w:val="false"/>
+                <w:sz w:val="20"/>
+                <w:szCs w:val="20"/>
+              </w:rPr>
+              <w:t xml:space="preserve">반복되는 논리</w:t>
+            </w:r>
+          </w:p>
+        </w:tc>
+        <w:tc>
+          <w:tcPr>
+            <w:tcW w:type="dxa" w:w="3569"/>
+            <w:tcBorders>
+              <w:top w:val="single" w:color="808080" w:sz="4"/>
+              <w:left w:val="single" w:color="808080" w:sz="4"/>
+              <w:bottom w:val="single" w:color="808080" w:sz="4"/>
+              <w:right w:val="single" w:color="808080" w:sz="4"/>
+            </w:tcBorders>
+            <w:tcMar>
+              <w:top w:type="dxa" w:w="80"/>
+              <w:left w:type="dxa" w:w="110"/>
+              <w:bottom w:type="dxa" w:w="80"/>
+              <w:right w:type="dxa" w:w="110"/>
+            </w:tcMar>
+            <w:vAlign w:val="center"/>
+          </w:tcPr>
+          <w:p>
+            <w:pPr>
+              <w:spacing w:line="320"/>
+              <w:jc w:val="left"/>
+            </w:pPr>
+            <w:r>
+              <w:rPr>
+                <w:rFonts w:ascii="맑은 고딕" w:cs="맑은 고딕" w:eastAsia="맑은 고딕" w:hAnsi="맑은 고딕"/>
+                <w:b w:val="false"/>
+                <w:bCs w:val="false"/>
+                <w:sz w:val="20"/>
+                <w:szCs w:val="20"/>
+              </w:rPr>
+              <w:t xml:space="preserve">"…라는 사정만으로 … 요구할 권한이 </w:t>
+            </w:r>
+            <w:r>
+              <w:rPr>
+                <w:rFonts w:ascii="맑은 고딕" w:cs="맑은 고딕" w:eastAsia="맑은 고딕" w:hAnsi="맑은 고딕"/>
+                <w:b/>
+                <w:bCs/>
+                <w:sz w:val="20"/>
+                <w:szCs w:val="20"/>
+              </w:rPr>
+              <w:t xml:space="preserve">당연히 발생하는 것은 아닙니다</w:t>
+            </w:r>
+            <w:r>
+              <w:rPr>
+                <w:rFonts w:ascii="맑은 고딕" w:cs="맑은 고딕" w:eastAsia="맑은 고딕" w:hAnsi="맑은 고딕"/>
+                <w:b w:val="false"/>
+                <w:bCs w:val="false"/>
+                <w:sz w:val="20"/>
+                <w:szCs w:val="20"/>
+              </w:rPr>
+              <w:t xml:space="preserve">"</w:t>
+            </w:r>
+          </w:p>
+        </w:tc>
+        <w:tc>
+          <w:tcPr>
+            <w:tcW w:type="dxa" w:w="3569"/>
+            <w:tcBorders>
+              <w:top w:val="single" w:color="808080" w:sz="4"/>
+              <w:left w:val="single" w:color="808080" w:sz="4"/>
+              <w:bottom w:val="single" w:color="808080" w:sz="4"/>
+              <w:right w:val="single" w:color="808080" w:sz="4"/>
+            </w:tcBorders>
+            <w:tcMar>
+              <w:top w:type="dxa" w:w="80"/>
+              <w:left w:type="dxa" w:w="110"/>
+              <w:bottom w:type="dxa" w:w="80"/>
+              <w:right w:type="dxa" w:w="110"/>
+            </w:tcMar>
+            <w:vAlign w:val="center"/>
+          </w:tcPr>
+          <w:p>
+            <w:pPr>
+              <w:spacing w:line="320"/>
+              <w:jc w:val="left"/>
+            </w:pPr>
+            <w:r>
+              <w:rPr>
+                <w:rFonts w:ascii="맑은 고딕" w:cs="맑은 고딕" w:eastAsia="맑은 고딕" w:hAnsi="맑은 고딕"/>
+                <w:b w:val="false"/>
+                <w:bCs w:val="false"/>
+                <w:sz w:val="20"/>
+                <w:szCs w:val="20"/>
+              </w:rPr>
+              <w:t xml:space="preserve">"…라는 사정만으로 … 요구할 권리가 </w:t>
+            </w:r>
+            <w:r>
+              <w:rPr>
+                <w:rFonts w:ascii="맑은 고딕" w:cs="맑은 고딕" w:eastAsia="맑은 고딕" w:hAnsi="맑은 고딕"/>
+                <w:b/>
+                <w:bCs/>
+                <w:sz w:val="20"/>
+                <w:szCs w:val="20"/>
+              </w:rPr>
+              <w:t xml:space="preserve">당연히 발생하는 것은 아닙니다</w:t>
+            </w:r>
+            <w:r>
+              <w:rPr>
+                <w:rFonts w:ascii="맑은 고딕" w:cs="맑은 고딕" w:eastAsia="맑은 고딕" w:hAnsi="맑은 고딕"/>
+                <w:b w:val="false"/>
+                <w:bCs w:val="false"/>
+                <w:sz w:val="20"/>
+                <w:szCs w:val="20"/>
+              </w:rPr>
+              <w:t xml:space="preserve">"</w:t>
+            </w:r>
+          </w:p>
+        </w:tc>
+      </w:tr>
+      <w:tr>
+        <w:trPr>
+          <w:cantSplit/>
+          <w:tblHeader w:val="off"/>
+        </w:trPr>
+        <w:tc>
+          <w:tcPr>
+            <w:tcW w:type="dxa" w:w="600"/>
+            <w:tcBorders>
+              <w:top w:val="single" w:color="808080" w:sz="4"/>
+              <w:left w:val="single" w:color="808080" w:sz="4"/>
+              <w:bottom w:val="single" w:color="808080" w:sz="4"/>
+              <w:right w:val="single" w:color="808080" w:sz="4"/>
+            </w:tcBorders>
+            <w:tcMar>
+              <w:top w:type="dxa" w:w="80"/>
+              <w:left w:type="dxa" w:w="110"/>
+              <w:bottom w:type="dxa" w:w="80"/>
+              <w:right w:type="dxa" w:w="110"/>
+            </w:tcMar>
+            <w:vAlign w:val="center"/>
+          </w:tcPr>
+          <w:p>
+            <w:pPr>
+              <w:spacing w:line="320"/>
+              <w:jc w:val="left"/>
+            </w:pPr>
+            <w:r>
+              <w:rPr>
+                <w:rFonts w:ascii="맑은 고딕" w:cs="맑은 고딕" w:eastAsia="맑은 고딕" w:hAnsi="맑은 고딕"/>
+                <w:b w:val="false"/>
+                <w:bCs w:val="false"/>
+                <w:sz w:val="20"/>
+                <w:szCs w:val="20"/>
+              </w:rPr>
+              <w:t xml:space="preserve">5</w:t>
+            </w:r>
+          </w:p>
+        </w:tc>
+        <w:tc>
+          <w:tcPr>
+            <w:tcW w:type="dxa" w:w="1900"/>
+            <w:tcBorders>
+              <w:top w:val="single" w:color="808080" w:sz="4"/>
+              <w:left w:val="single" w:color="808080" w:sz="4"/>
+              <w:bottom w:val="single" w:color="808080" w:sz="4"/>
+              <w:right w:val="single" w:color="808080" w:sz="4"/>
+            </w:tcBorders>
+            <w:tcMar>
+              <w:top w:type="dxa" w:w="80"/>
+              <w:left w:type="dxa" w:w="110"/>
+              <w:bottom w:type="dxa" w:w="80"/>
+              <w:right w:type="dxa" w:w="110"/>
+            </w:tcMar>
+            <w:vAlign w:val="center"/>
+          </w:tcPr>
+          <w:p>
+            <w:pPr>
+              <w:spacing w:line="320"/>
+              <w:jc w:val="left"/>
+            </w:pPr>
+            <w:r>
+              <w:rPr>
+                <w:rFonts w:ascii="맑은 고딕" w:cs="맑은 고딕" w:eastAsia="맑은 고딕" w:hAnsi="맑은 고딕"/>
+                <w:b w:val="false"/>
+                <w:bCs w:val="false"/>
+                <w:sz w:val="20"/>
+                <w:szCs w:val="20"/>
+              </w:rPr>
+              <w:t xml:space="preserve">근거 제시 요구</w:t>
+            </w:r>
+          </w:p>
+        </w:tc>
+        <w:tc>
+          <w:tcPr>
+            <w:tcW w:type="dxa" w:w="3569"/>
+            <w:tcBorders>
+              <w:top w:val="single" w:color="808080" w:sz="4"/>
+              <w:left w:val="single" w:color="808080" w:sz="4"/>
+              <w:bottom w:val="single" w:color="808080" w:sz="4"/>
+              <w:right w:val="single" w:color="808080" w:sz="4"/>
+            </w:tcBorders>
+            <w:tcMar>
+              <w:top w:type="dxa" w:w="80"/>
+              <w:left w:type="dxa" w:w="110"/>
+              <w:bottom w:type="dxa" w:w="80"/>
+              <w:right w:type="dxa" w:w="110"/>
+            </w:tcMar>
+            <w:vAlign w:val="center"/>
+          </w:tcPr>
+          <w:p>
+            <w:pPr>
+              <w:spacing w:line="320"/>
+              <w:jc w:val="left"/>
+            </w:pPr>
+            <w:r>
+              <w:rPr>
+                <w:rFonts w:ascii="맑은 고딕" w:cs="맑은 고딕" w:eastAsia="맑은 고딕" w:hAnsi="맑은 고딕"/>
+                <w:b w:val="false"/>
+                <w:bCs w:val="false"/>
+                <w:sz w:val="20"/>
+                <w:szCs w:val="20"/>
+              </w:rPr>
+              <w:t xml:space="preserve">법률상·계약상 근거 등 </w:t>
+            </w:r>
+            <w:r>
+              <w:rPr>
+                <w:rFonts w:ascii="맑은 고딕" w:cs="맑은 고딕" w:eastAsia="맑은 고딕" w:hAnsi="맑은 고딕"/>
+                <w:b/>
+                <w:bCs/>
+                <w:sz w:val="20"/>
+                <w:szCs w:val="20"/>
+              </w:rPr>
+              <w:t xml:space="preserve">5가지 자료</w:t>
+            </w:r>
+            <w:r>
+              <w:rPr>
+                <w:rFonts w:ascii="맑은 고딕" w:cs="맑은 고딕" w:eastAsia="맑은 고딕" w:hAnsi="맑은 고딕"/>
+                <w:b w:val="false"/>
+                <w:bCs w:val="false"/>
+                <w:sz w:val="20"/>
+                <w:szCs w:val="20"/>
+              </w:rPr>
+              <w:t xml:space="preserve">를 제출하라고 요구</w:t>
+            </w:r>
+          </w:p>
+        </w:tc>
+        <w:tc>
+          <w:tcPr>
+            <w:tcW w:type="dxa" w:w="3569"/>
+            <w:tcBorders>
+              <w:top w:val="single" w:color="808080" w:sz="4"/>
+              <w:left w:val="single" w:color="808080" w:sz="4"/>
+              <w:bottom w:val="single" w:color="808080" w:sz="4"/>
+              <w:right w:val="single" w:color="808080" w:sz="4"/>
+            </w:tcBorders>
+            <w:tcMar>
+              <w:top w:type="dxa" w:w="80"/>
+              <w:left w:type="dxa" w:w="110"/>
+              <w:bottom w:type="dxa" w:w="80"/>
+              <w:right w:type="dxa" w:w="110"/>
+            </w:tcMar>
+            <w:vAlign w:val="center"/>
+          </w:tcPr>
+          <w:p>
+            <w:pPr>
+              <w:spacing w:line="320"/>
+              <w:jc w:val="left"/>
+            </w:pPr>
+            <w:r>
+              <w:rPr>
+                <w:rFonts w:ascii="맑은 고딕" w:cs="맑은 고딕" w:eastAsia="맑은 고딕" w:hAnsi="맑은 고딕"/>
+                <w:b w:val="false"/>
+                <w:bCs w:val="false"/>
+                <w:sz w:val="20"/>
+                <w:szCs w:val="20"/>
+              </w:rPr>
+              <w:t xml:space="preserve">협약 무효의 근거, 피해 자료 등 </w:t>
+            </w:r>
+            <w:r>
+              <w:rPr>
+                <w:rFonts w:ascii="맑은 고딕" w:cs="맑은 고딕" w:eastAsia="맑은 고딕" w:hAnsi="맑은 고딕"/>
+                <w:b/>
+                <w:bCs/>
+                <w:sz w:val="20"/>
+                <w:szCs w:val="20"/>
+              </w:rPr>
+              <w:t xml:space="preserve">구체적 근거</w:t>
+            </w:r>
+            <w:r>
+              <w:rPr>
+                <w:rFonts w:ascii="맑은 고딕" w:cs="맑은 고딕" w:eastAsia="맑은 고딕" w:hAnsi="맑은 고딕"/>
+                <w:b w:val="false"/>
+                <w:bCs w:val="false"/>
+                <w:sz w:val="20"/>
+                <w:szCs w:val="20"/>
+              </w:rPr>
+              <w:t xml:space="preserve">를 제시하라고 요구</w:t>
+            </w:r>
+          </w:p>
+        </w:tc>
+      </w:tr>
+      <w:tr>
+        <w:trPr>
+          <w:cantSplit/>
+          <w:tblHeader w:val="off"/>
+        </w:trPr>
+        <w:tc>
+          <w:tcPr>
+            <w:tcW w:type="dxa" w:w="600"/>
+            <w:tcBorders>
+              <w:top w:val="single" w:color="808080" w:sz="4"/>
+              <w:left w:val="single" w:color="808080" w:sz="4"/>
+              <w:bottom w:val="single" w:color="808080" w:sz="4"/>
+              <w:right w:val="single" w:color="808080" w:sz="4"/>
+            </w:tcBorders>
+            <w:tcMar>
+              <w:top w:type="dxa" w:w="80"/>
+              <w:left w:type="dxa" w:w="110"/>
+              <w:bottom w:type="dxa" w:w="80"/>
+              <w:right w:type="dxa" w:w="110"/>
+            </w:tcMar>
+            <w:vAlign w:val="center"/>
+          </w:tcPr>
+          <w:p>
+            <w:pPr>
+              <w:spacing w:line="320"/>
+              <w:jc w:val="left"/>
+            </w:pPr>
+            <w:r>
+              <w:rPr>
+                <w:rFonts w:ascii="맑은 고딕" w:cs="맑은 고딕" w:eastAsia="맑은 고딕" w:hAnsi="맑은 고딕"/>
+                <w:b w:val="false"/>
+                <w:bCs w:val="false"/>
+                <w:sz w:val="20"/>
+                <w:szCs w:val="20"/>
+              </w:rPr>
+              <w:t xml:space="preserve">6</w:t>
+            </w:r>
+          </w:p>
+        </w:tc>
+        <w:tc>
+          <w:tcPr>
+            <w:tcW w:type="dxa" w:w="1900"/>
+            <w:tcBorders>
+              <w:top w:val="single" w:color="808080" w:sz="4"/>
+              <w:left w:val="single" w:color="808080" w:sz="4"/>
+              <w:bottom w:val="single" w:color="808080" w:sz="4"/>
+              <w:right w:val="single" w:color="808080" w:sz="4"/>
+            </w:tcBorders>
+            <w:tcMar>
+              <w:top w:type="dxa" w:w="80"/>
+              <w:left w:type="dxa" w:w="110"/>
+              <w:bottom w:type="dxa" w:w="80"/>
+              <w:right w:type="dxa" w:w="110"/>
+            </w:tcMar>
+            <w:vAlign w:val="center"/>
+          </w:tcPr>
+          <w:p>
+            <w:pPr>
+              <w:spacing w:line="320"/>
+              <w:jc w:val="left"/>
+            </w:pPr>
+            <w:r>
+              <w:rPr>
+                <w:rFonts w:ascii="맑은 고딕" w:cs="맑은 고딕" w:eastAsia="맑은 고딕" w:hAnsi="맑은 고딕"/>
+                <w:b w:val="false"/>
+                <w:bCs w:val="false"/>
+                <w:sz w:val="20"/>
+                <w:szCs w:val="20"/>
+              </w:rPr>
+              <w:t xml:space="preserve">경고 항목</w:t>
+            </w:r>
+          </w:p>
+        </w:tc>
+        <w:tc>
+          <w:tcPr>
+            <w:tcW w:type="dxa" w:w="3569"/>
+            <w:tcBorders>
+              <w:top w:val="single" w:color="808080" w:sz="4"/>
+              <w:left w:val="single" w:color="808080" w:sz="4"/>
+              <w:bottom w:val="single" w:color="808080" w:sz="4"/>
+              <w:right w:val="single" w:color="808080" w:sz="4"/>
+            </w:tcBorders>
+            <w:tcMar>
+              <w:top w:type="dxa" w:w="80"/>
+              <w:left w:type="dxa" w:w="110"/>
+              <w:bottom w:type="dxa" w:w="80"/>
+              <w:right w:type="dxa" w:w="110"/>
+            </w:tcMar>
+            <w:vAlign w:val="center"/>
+          </w:tcPr>
+          <w:p>
+            <w:pPr>
+              <w:spacing w:line="320"/>
+              <w:jc w:val="left"/>
+            </w:pPr>
+            <w:r>
+              <w:rPr>
+                <w:rFonts w:ascii="맑은 고딕" w:cs="맑은 고딕" w:eastAsia="맑은 고딕" w:hAnsi="맑은 고딕"/>
+                <w:b w:val="false"/>
+                <w:bCs w:val="false"/>
+                <w:sz w:val="20"/>
+                <w:szCs w:val="20"/>
+              </w:rPr>
+              <w:t xml:space="preserve">5항 "근거 없는 주장과 공개적인 유포의 </w:t>
+            </w:r>
+            <w:r>
+              <w:rPr>
+                <w:rFonts w:ascii="맑은 고딕" w:cs="맑은 고딕" w:eastAsia="맑은 고딕" w:hAnsi="맑은 고딕"/>
+                <w:b/>
+                <w:bCs/>
+                <w:sz w:val="20"/>
+                <w:szCs w:val="20"/>
+              </w:rPr>
+              <w:t xml:space="preserve">중단 요청</w:t>
+            </w:r>
+            <w:r>
+              <w:rPr>
+                <w:rFonts w:ascii="맑은 고딕" w:cs="맑은 고딕" w:eastAsia="맑은 고딕" w:hAnsi="맑은 고딕"/>
+                <w:b w:val="false"/>
+                <w:bCs w:val="false"/>
+                <w:sz w:val="20"/>
+                <w:szCs w:val="20"/>
+              </w:rPr>
+              <w:t xml:space="preserve">"</w:t>
+            </w:r>
+          </w:p>
+        </w:tc>
+        <w:tc>
+          <w:tcPr>
+            <w:tcW w:type="dxa" w:w="3569"/>
+            <w:tcBorders>
+              <w:top w:val="single" w:color="808080" w:sz="4"/>
+              <w:left w:val="single" w:color="808080" w:sz="4"/>
+              <w:bottom w:val="single" w:color="808080" w:sz="4"/>
+              <w:right w:val="single" w:color="808080" w:sz="4"/>
+            </w:tcBorders>
+            <w:tcMar>
+              <w:top w:type="dxa" w:w="80"/>
+              <w:left w:type="dxa" w:w="110"/>
+              <w:bottom w:type="dxa" w:w="80"/>
+              <w:right w:type="dxa" w:w="110"/>
+            </w:tcMar>
+            <w:vAlign w:val="center"/>
+          </w:tcPr>
+          <w:p>
+            <w:pPr>
+              <w:spacing w:line="320"/>
+              <w:jc w:val="left"/>
+            </w:pPr>
+            <w:r>
+              <w:rPr>
+                <w:rFonts w:ascii="맑은 고딕" w:cs="맑은 고딕" w:eastAsia="맑은 고딕" w:hAnsi="맑은 고딕"/>
+                <w:b w:val="false"/>
+                <w:bCs w:val="false"/>
+                <w:sz w:val="20"/>
+                <w:szCs w:val="20"/>
+              </w:rPr>
+              <w:t xml:space="preserve">8항 "확인되지 않은 주장과 부당한 요구의 </w:t>
+            </w:r>
+            <w:r>
+              <w:rPr>
+                <w:rFonts w:ascii="맑은 고딕" w:cs="맑은 고딕" w:eastAsia="맑은 고딕" w:hAnsi="맑은 고딕"/>
+                <w:b/>
+                <w:bCs/>
+                <w:sz w:val="20"/>
+                <w:szCs w:val="20"/>
+              </w:rPr>
+              <w:t xml:space="preserve">중단 요청</w:t>
+            </w:r>
+            <w:r>
+              <w:rPr>
+                <w:rFonts w:ascii="맑은 고딕" w:cs="맑은 고딕" w:eastAsia="맑은 고딕" w:hAnsi="맑은 고딕"/>
+                <w:b w:val="false"/>
+                <w:bCs w:val="false"/>
+                <w:sz w:val="20"/>
+                <w:szCs w:val="20"/>
+              </w:rPr>
+              <w:t xml:space="preserve">"</w:t>
+            </w:r>
+          </w:p>
+        </w:tc>
+      </w:tr>
+      <w:tr>
+        <w:trPr>
+          <w:cantSplit/>
+          <w:tblHeader w:val="off"/>
+        </w:trPr>
+        <w:tc>
+          <w:tcPr>
+            <w:tcW w:type="dxa" w:w="600"/>
+            <w:tcBorders>
+              <w:top w:val="single" w:color="808080" w:sz="4"/>
+              <w:left w:val="single" w:color="808080" w:sz="4"/>
+              <w:bottom w:val="single" w:color="808080" w:sz="4"/>
+              <w:right w:val="single" w:color="808080" w:sz="4"/>
+            </w:tcBorders>
+            <w:tcMar>
+              <w:top w:type="dxa" w:w="80"/>
+              <w:left w:type="dxa" w:w="110"/>
+              <w:bottom w:type="dxa" w:w="80"/>
+              <w:right w:type="dxa" w:w="110"/>
+            </w:tcMar>
+            <w:vAlign w:val="center"/>
+          </w:tcPr>
+          <w:p>
+            <w:pPr>
+              <w:spacing w:line="320"/>
+              <w:jc w:val="left"/>
+            </w:pPr>
+            <w:r>
+              <w:rPr>
+                <w:rFonts w:ascii="맑은 고딕" w:cs="맑은 고딕" w:eastAsia="맑은 고딕" w:hAnsi="맑은 고딕"/>
+                <w:b w:val="false"/>
+                <w:bCs w:val="false"/>
+                <w:sz w:val="20"/>
+                <w:szCs w:val="20"/>
+              </w:rPr>
+              <w:t xml:space="preserve">7</w:t>
+            </w:r>
+          </w:p>
+        </w:tc>
+        <w:tc>
+          <w:tcPr>
+            <w:tcW w:type="dxa" w:w="1900"/>
+            <w:tcBorders>
+              <w:top w:val="single" w:color="808080" w:sz="4"/>
+              <w:left w:val="single" w:color="808080" w:sz="4"/>
+              <w:bottom w:val="single" w:color="808080" w:sz="4"/>
+              <w:right w:val="single" w:color="808080" w:sz="4"/>
+            </w:tcBorders>
+            <w:tcMar>
+              <w:top w:type="dxa" w:w="80"/>
+              <w:left w:type="dxa" w:w="110"/>
+              <w:bottom w:type="dxa" w:w="80"/>
+              <w:right w:type="dxa" w:w="110"/>
+            </w:tcMar>
+            <w:vAlign w:val="center"/>
+          </w:tcPr>
+          <w:p>
+            <w:pPr>
+              <w:spacing w:line="320"/>
+              <w:jc w:val="left"/>
+            </w:pPr>
+            <w:r>
+              <w:rPr>
+                <w:rFonts w:ascii="맑은 고딕" w:cs="맑은 고딕" w:eastAsia="맑은 고딕" w:hAnsi="맑은 고딕"/>
+                <w:b w:val="false"/>
+                <w:bCs w:val="false"/>
+                <w:sz w:val="20"/>
+                <w:szCs w:val="20"/>
+              </w:rPr>
+              <w:t xml:space="preserve">법적 조치 예고</w:t>
+            </w:r>
+          </w:p>
+        </w:tc>
+        <w:tc>
+          <w:tcPr>
+            <w:tcW w:type="dxa" w:w="3569"/>
+            <w:tcBorders>
+              <w:top w:val="single" w:color="808080" w:sz="4"/>
+              <w:left w:val="single" w:color="808080" w:sz="4"/>
+              <w:bottom w:val="single" w:color="808080" w:sz="4"/>
+              <w:right w:val="single" w:color="808080" w:sz="4"/>
+            </w:tcBorders>
+            <w:tcMar>
+              <w:top w:type="dxa" w:w="80"/>
+              <w:left w:type="dxa" w:w="110"/>
+              <w:bottom w:type="dxa" w:w="80"/>
+              <w:right w:type="dxa" w:w="110"/>
+            </w:tcMar>
+            <w:vAlign w:val="center"/>
+          </w:tcPr>
+          <w:p>
+            <w:pPr>
+              <w:spacing w:line="320"/>
+              <w:jc w:val="left"/>
+            </w:pPr>
+            <w:r>
+              <w:rPr>
+                <w:rFonts w:ascii="맑은 고딕" w:cs="맑은 고딕" w:eastAsia="맑은 고딕" w:hAnsi="맑은 고딕"/>
+                <w:b w:val="false"/>
+                <w:bCs w:val="false"/>
+                <w:sz w:val="20"/>
+                <w:szCs w:val="20"/>
+              </w:rPr>
+              <w:t xml:space="preserve">"필요한 법적 조치를 검토할 수밖에 없음을 알려드립니다"</w:t>
+            </w:r>
+          </w:p>
+        </w:tc>
+        <w:tc>
+          <w:tcPr>
+            <w:tcW w:type="dxa" w:w="3569"/>
+            <w:tcBorders>
+              <w:top w:val="single" w:color="808080" w:sz="4"/>
+              <w:left w:val="single" w:color="808080" w:sz="4"/>
+              <w:bottom w:val="single" w:color="808080" w:sz="4"/>
+              <w:right w:val="single" w:color="808080" w:sz="4"/>
+            </w:tcBorders>
+            <w:tcMar>
+              <w:top w:type="dxa" w:w="80"/>
+              <w:left w:type="dxa" w:w="110"/>
+              <w:bottom w:type="dxa" w:w="80"/>
+              <w:right w:type="dxa" w:w="110"/>
+            </w:tcMar>
+            <w:vAlign w:val="center"/>
+          </w:tcPr>
+          <w:p>
+            <w:pPr>
+              <w:spacing w:line="320"/>
+              <w:jc w:val="left"/>
+            </w:pPr>
+            <w:r>
+              <w:rPr>
+                <w:rFonts w:ascii="맑은 고딕" w:cs="맑은 고딕" w:eastAsia="맑은 고딕" w:hAnsi="맑은 고딕"/>
+                <w:b w:val="false"/>
+                <w:bCs w:val="false"/>
+                <w:sz w:val="20"/>
+                <w:szCs w:val="20"/>
+              </w:rPr>
+              <w:t xml:space="preserve">"필요한 조치를 취할 수 있음을 알려드립니다"</w:t>
+            </w:r>
+          </w:p>
+        </w:tc>
+      </w:tr>
+      <w:tr>
+        <w:trPr>
+          <w:cantSplit/>
+          <w:tblHeader w:val="off"/>
+        </w:trPr>
+        <w:tc>
+          <w:tcPr>
+            <w:tcW w:type="dxa" w:w="600"/>
+            <w:tcBorders>
+              <w:top w:val="single" w:color="808080" w:sz="4"/>
+              <w:left w:val="single" w:color="808080" w:sz="4"/>
+              <w:bottom w:val="single" w:color="808080" w:sz="4"/>
+              <w:right w:val="single" w:color="808080" w:sz="4"/>
+            </w:tcBorders>
+            <w:tcMar>
+              <w:top w:type="dxa" w:w="80"/>
+              <w:left w:type="dxa" w:w="110"/>
+              <w:bottom w:type="dxa" w:w="80"/>
+              <w:right w:type="dxa" w:w="110"/>
+            </w:tcMar>
+            <w:vAlign w:val="center"/>
+          </w:tcPr>
+          <w:p>
+            <w:pPr>
+              <w:spacing w:line="320"/>
+              <w:jc w:val="left"/>
+            </w:pPr>
+            <w:r>
+              <w:rPr>
+                <w:rFonts w:ascii="맑은 고딕" w:cs="맑은 고딕" w:eastAsia="맑은 고딕" w:hAnsi="맑은 고딕"/>
+                <w:b w:val="false"/>
+                <w:bCs w:val="false"/>
+                <w:sz w:val="20"/>
+                <w:szCs w:val="20"/>
+              </w:rPr>
+              <w:t xml:space="preserve">8</w:t>
+            </w:r>
+          </w:p>
+        </w:tc>
+        <w:tc>
+          <w:tcPr>
+            <w:tcW w:type="dxa" w:w="1900"/>
+            <w:tcBorders>
+              <w:top w:val="single" w:color="808080" w:sz="4"/>
+              <w:left w:val="single" w:color="808080" w:sz="4"/>
+              <w:bottom w:val="single" w:color="808080" w:sz="4"/>
+              <w:right w:val="single" w:color="808080" w:sz="4"/>
+            </w:tcBorders>
+            <w:tcMar>
+              <w:top w:type="dxa" w:w="80"/>
+              <w:left w:type="dxa" w:w="110"/>
+              <w:bottom w:type="dxa" w:w="80"/>
+              <w:right w:type="dxa" w:w="110"/>
+            </w:tcMar>
+            <w:vAlign w:val="center"/>
+          </w:tcPr>
+          <w:p>
+            <w:pPr>
+              <w:spacing w:line="320"/>
+              <w:jc w:val="left"/>
+            </w:pPr>
+            <w:r>
+              <w:rPr>
+                <w:rFonts w:ascii="맑은 고딕" w:cs="맑은 고딕" w:eastAsia="맑은 고딕" w:hAnsi="맑은 고딕"/>
+                <w:b w:val="false"/>
+                <w:bCs w:val="false"/>
+                <w:sz w:val="20"/>
+                <w:szCs w:val="20"/>
+              </w:rPr>
+              <w:t xml:space="preserve">맺음말</w:t>
+            </w:r>
+          </w:p>
+        </w:tc>
+        <w:tc>
+          <w:tcPr>
+            <w:tcW w:type="dxa" w:w="3569"/>
+            <w:tcBorders>
+              <w:top w:val="single" w:color="808080" w:sz="4"/>
+              <w:left w:val="single" w:color="808080" w:sz="4"/>
+              <w:bottom w:val="single" w:color="808080" w:sz="4"/>
+              <w:right w:val="single" w:color="808080" w:sz="4"/>
+            </w:tcBorders>
+            <w:tcMar>
+              <w:top w:type="dxa" w:w="80"/>
+              <w:left w:type="dxa" w:w="110"/>
+              <w:bottom w:type="dxa" w:w="80"/>
+              <w:right w:type="dxa" w:w="110"/>
+            </w:tcMar>
+            <w:vAlign w:val="center"/>
+          </w:tcPr>
+          <w:p>
+            <w:pPr>
+              <w:spacing w:line="320"/>
+              <w:jc w:val="left"/>
+            </w:pPr>
+            <w:r>
+              <w:rPr>
+                <w:rFonts w:ascii="맑은 고딕" w:cs="맑은 고딕" w:eastAsia="맑은 고딕" w:hAnsi="맑은 고딕"/>
+                <w:b w:val="false"/>
+                <w:bCs w:val="false"/>
+                <w:sz w:val="20"/>
+                <w:szCs w:val="20"/>
+              </w:rPr>
+              <w:t xml:space="preserve">"현재까지 … 확인한 사실과 보유 자료에 근거하여 작성된 것이며 … 어떠한 법률상 권리도 </w:t>
+            </w:r>
+            <w:r>
+              <w:rPr>
+                <w:rFonts w:ascii="맑은 고딕" w:cs="맑은 고딕" w:eastAsia="맑은 고딕" w:hAnsi="맑은 고딕"/>
+                <w:b/>
+                <w:bCs/>
+                <w:sz w:val="20"/>
+                <w:szCs w:val="20"/>
+              </w:rPr>
+              <w:t xml:space="preserve">포기하는 취지가 아닙니다</w:t>
+            </w:r>
+            <w:r>
+              <w:rPr>
+                <w:rFonts w:ascii="맑은 고딕" w:cs="맑은 고딕" w:eastAsia="맑은 고딕" w:hAnsi="맑은 고딕"/>
+                <w:b w:val="false"/>
+                <w:bCs w:val="false"/>
+                <w:sz w:val="20"/>
+                <w:szCs w:val="20"/>
+              </w:rPr>
+              <w:t xml:space="preserve">"</w:t>
+            </w:r>
+          </w:p>
+        </w:tc>
+        <w:tc>
+          <w:tcPr>
+            <w:tcW w:type="dxa" w:w="3569"/>
+            <w:tcBorders>
+              <w:top w:val="single" w:color="808080" w:sz="4"/>
+              <w:left w:val="single" w:color="808080" w:sz="4"/>
+              <w:bottom w:val="single" w:color="808080" w:sz="4"/>
+              <w:right w:val="single" w:color="808080" w:sz="4"/>
+            </w:tcBorders>
+            <w:tcMar>
+              <w:top w:type="dxa" w:w="80"/>
+              <w:left w:type="dxa" w:w="110"/>
+              <w:bottom w:type="dxa" w:w="80"/>
+              <w:right w:type="dxa" w:w="110"/>
+            </w:tcMar>
+            <w:vAlign w:val="center"/>
+          </w:tcPr>
+          <w:p>
+            <w:pPr>
+              <w:spacing w:line="320"/>
+              <w:jc w:val="left"/>
+            </w:pPr>
+            <w:r>
+              <w:rPr>
+                <w:rFonts w:ascii="맑은 고딕" w:cs="맑은 고딕" w:eastAsia="맑은 고딕" w:hAnsi="맑은 고딕"/>
+                <w:b w:val="false"/>
+                <w:bCs w:val="false"/>
+                <w:sz w:val="20"/>
+                <w:szCs w:val="20"/>
+              </w:rPr>
+              <w:t xml:space="preserve">"현재까지 … 확인한 사실과 보유 자료를 바탕으로 작성한 것입니다 … 권리 및 방어권을 </w:t>
+            </w:r>
+            <w:r>
+              <w:rPr>
+                <w:rFonts w:ascii="맑은 고딕" w:cs="맑은 고딕" w:eastAsia="맑은 고딕" w:hAnsi="맑은 고딕"/>
+                <w:b/>
+                <w:bCs/>
+                <w:sz w:val="20"/>
+                <w:szCs w:val="20"/>
+              </w:rPr>
+              <w:t xml:space="preserve">포기하는 취지가 아닙니다</w:t>
+            </w:r>
+            <w:r>
+              <w:rPr>
+                <w:rFonts w:ascii="맑은 고딕" w:cs="맑은 고딕" w:eastAsia="맑은 고딕" w:hAnsi="맑은 고딕"/>
+                <w:b w:val="false"/>
+                <w:bCs w:val="false"/>
+                <w:sz w:val="20"/>
+                <w:szCs w:val="20"/>
+              </w:rPr>
+              <w:t xml:space="preserve">"</w:t>
+            </w:r>
+          </w:p>
+        </w:tc>
+      </w:tr>
+      <w:tr>
+        <w:trPr>
+          <w:cantSplit/>
+          <w:tblHeader w:val="off"/>
+        </w:trPr>
+        <w:tc>
+          <w:tcPr>
+            <w:tcW w:type="dxa" w:w="600"/>
+            <w:tcBorders>
+              <w:top w:val="single" w:color="808080" w:sz="4"/>
+              <w:left w:val="single" w:color="808080" w:sz="4"/>
+              <w:bottom w:val="single" w:color="808080" w:sz="4"/>
+              <w:right w:val="single" w:color="808080" w:sz="4"/>
+            </w:tcBorders>
+            <w:tcMar>
+              <w:top w:type="dxa" w:w="80"/>
+              <w:left w:type="dxa" w:w="110"/>
+              <w:bottom w:type="dxa" w:w="80"/>
+              <w:right w:type="dxa" w:w="110"/>
+            </w:tcMar>
+            <w:vAlign w:val="center"/>
+          </w:tcPr>
+          <w:p>
+            <w:pPr>
+              <w:spacing w:line="320"/>
+              <w:jc w:val="left"/>
+            </w:pPr>
+            <w:r>
+              <w:rPr>
+                <w:rFonts w:ascii="맑은 고딕" w:cs="맑은 고딕" w:eastAsia="맑은 고딕" w:hAnsi="맑은 고딕"/>
+                <w:b w:val="false"/>
+                <w:bCs w:val="false"/>
+                <w:sz w:val="20"/>
+                <w:szCs w:val="20"/>
+              </w:rPr>
+              <w:t xml:space="preserve">9</w:t>
+            </w:r>
+          </w:p>
+        </w:tc>
+        <w:tc>
+          <w:tcPr>
+            <w:tcW w:type="dxa" w:w="1900"/>
+            <w:tcBorders>
+              <w:top w:val="single" w:color="808080" w:sz="4"/>
+              <w:left w:val="single" w:color="808080" w:sz="4"/>
+              <w:bottom w:val="single" w:color="808080" w:sz="4"/>
+              <w:right w:val="single" w:color="808080" w:sz="4"/>
+            </w:tcBorders>
+            <w:tcMar>
+              <w:top w:type="dxa" w:w="80"/>
+              <w:left w:type="dxa" w:w="110"/>
+              <w:bottom w:type="dxa" w:w="80"/>
+              <w:right w:type="dxa" w:w="110"/>
+            </w:tcMar>
+            <w:vAlign w:val="center"/>
+          </w:tcPr>
+          <w:p>
+            <w:pPr>
+              <w:spacing w:line="320"/>
+              <w:jc w:val="left"/>
+            </w:pPr>
+            <w:r>
+              <w:rPr>
+                <w:rFonts w:ascii="맑은 고딕" w:cs="맑은 고딕" w:eastAsia="맑은 고딕" w:hAnsi="맑은 고딕"/>
+                <w:b w:val="false"/>
+                <w:bCs w:val="false"/>
+                <w:sz w:val="20"/>
+                <w:szCs w:val="20"/>
+              </w:rPr>
+              <w:t xml:space="preserve">상대방 언급</w:t>
+            </w:r>
+          </w:p>
+        </w:tc>
+        <w:tc>
+          <w:tcPr>
+            <w:tcW w:type="dxa" w:w="3569"/>
+            <w:tcBorders>
+              <w:top w:val="single" w:color="808080" w:sz="4"/>
+              <w:left w:val="single" w:color="808080" w:sz="4"/>
+              <w:bottom w:val="single" w:color="808080" w:sz="4"/>
+              <w:right w:val="single" w:color="808080" w:sz="4"/>
+            </w:tcBorders>
+            <w:tcMar>
+              <w:top w:type="dxa" w:w="80"/>
+              <w:left w:type="dxa" w:w="110"/>
+              <w:bottom w:type="dxa" w:w="80"/>
+              <w:right w:type="dxa" w:w="110"/>
+            </w:tcMar>
+            <w:vAlign w:val="center"/>
+          </w:tcPr>
+          <w:p>
+            <w:pPr>
+              <w:spacing w:line="320"/>
+              <w:jc w:val="left"/>
+            </w:pPr>
+            <w:r>
+              <w:rPr>
+                <w:rFonts w:ascii="맑은 고딕" w:cs="맑은 고딕" w:eastAsia="맑은 고딕" w:hAnsi="맑은 고딕"/>
+                <w:b w:val="false"/>
+                <w:bCs w:val="false"/>
+                <w:sz w:val="20"/>
+                <w:szCs w:val="20"/>
+              </w:rPr>
+              <w:t xml:space="preserve">"</w:t>
+            </w:r>
+            <w:r>
+              <w:rPr>
+                <w:rFonts w:ascii="맑은 고딕" w:cs="맑은 고딕" w:eastAsia="맑은 고딕" w:hAnsi="맑은 고딕"/>
+                <w:b/>
+                <w:bCs/>
+                <w:sz w:val="20"/>
+                <w:szCs w:val="20"/>
+              </w:rPr>
+              <w:t xml:space="preserve">순정축협에 먼저</w:t>
+            </w:r>
+            <w:r>
+              <w:rPr>
+                <w:rFonts w:ascii="맑은 고딕" w:cs="맑은 고딕" w:eastAsia="맑은 고딕" w:hAnsi="맑은 고딕"/>
+                <w:b w:val="false"/>
+                <w:bCs w:val="false"/>
+                <w:sz w:val="20"/>
+                <w:szCs w:val="20"/>
+              </w:rPr>
+              <w:t xml:space="preserve"> 공식적으로 확인하는 것이 타당합니다"</w:t>
+            </w:r>
+          </w:p>
+        </w:tc>
+        <w:tc>
+          <w:tcPr>
+            <w:tcW w:type="dxa" w:w="3569"/>
+            <w:tcBorders>
+              <w:top w:val="single" w:color="808080" w:sz="4"/>
+              <w:left w:val="single" w:color="808080" w:sz="4"/>
+              <w:bottom w:val="single" w:color="808080" w:sz="4"/>
+              <w:right w:val="single" w:color="808080" w:sz="4"/>
+            </w:tcBorders>
+            <w:tcMar>
+              <w:top w:type="dxa" w:w="80"/>
+              <w:left w:type="dxa" w:w="110"/>
+              <w:bottom w:type="dxa" w:w="80"/>
+              <w:right w:type="dxa" w:w="110"/>
+            </w:tcMar>
+            <w:vAlign w:val="center"/>
+          </w:tcPr>
+          <w:p>
+            <w:pPr>
+              <w:spacing w:line="320"/>
+              <w:jc w:val="left"/>
+            </w:pPr>
+            <w:r>
+              <w:rPr>
+                <w:rFonts w:ascii="맑은 고딕" w:cs="맑은 고딕" w:eastAsia="맑은 고딕" w:hAnsi="맑은 고딕"/>
+                <w:b w:val="false"/>
+                <w:bCs w:val="false"/>
+                <w:sz w:val="20"/>
+                <w:szCs w:val="20"/>
+              </w:rPr>
+              <w:t xml:space="preserve">위원회의 구성원과 법적 지위를 </w:t>
+            </w:r>
+            <w:r>
+              <w:rPr>
+                <w:rFonts w:ascii="맑은 고딕" w:cs="맑은 고딕" w:eastAsia="맑은 고딕" w:hAnsi="맑은 고딕"/>
+                <w:b/>
+                <w:bCs/>
+                <w:sz w:val="20"/>
+                <w:szCs w:val="20"/>
+              </w:rPr>
+              <w:t xml:space="preserve">대신 설명하고</w:t>
+            </w:r>
+            <w:r>
+              <w:rPr>
+                <w:rFonts w:ascii="맑은 고딕" w:cs="맑은 고딕" w:eastAsia="맑은 고딕" w:hAnsi="맑은 고딕"/>
+                <w:b w:val="false"/>
+                <w:bCs w:val="false"/>
+                <w:sz w:val="20"/>
+                <w:szCs w:val="20"/>
+              </w:rPr>
+              <w:t xml:space="preserve">, 미등록 단체라도 위법하지 않다고 </w:t>
+            </w:r>
+            <w:r>
+              <w:rPr>
+                <w:rFonts w:ascii="맑은 고딕" w:cs="맑은 고딕" w:eastAsia="맑은 고딕" w:hAnsi="맑은 고딕"/>
+                <w:b/>
+                <w:bCs/>
+                <w:sz w:val="20"/>
+                <w:szCs w:val="20"/>
+              </w:rPr>
+              <w:t xml:space="preserve">옹호</w:t>
+            </w:r>
+          </w:p>
+        </w:tc>
+      </w:tr>
+    </w:tbl>
+    <w:p>
+      <w:pPr>
+        <w:spacing w:after="120"/>
+      </w:pPr>
     </w:p>
     <w:p>
       <w:pPr>
@@ -1508,28 +3338,38 @@
       <w:r>
         <w:rPr>
           <w:rFonts w:ascii="맑은 고딕" w:cs="맑은 고딕" w:eastAsia="맑은 고딕" w:hAnsi="맑은 고딕"/>
-          <w:sz w:val="22"/>
-          <w:szCs w:val="22"/>
-        </w:rPr>
-        <w:t xml:space="preserve">순정축협의 위 1억 원 지급 관련 </w:t>
-      </w:r>
-      <w:r>
-        <w:rPr>
-          <w:rFonts w:ascii="맑은 고딕" w:cs="맑은 고딕" w:eastAsia="맑은 고딕" w:hAnsi="맑은 고딕"/>
-          <w:b/>
-          <w:bCs/>
-          <w:sz w:val="22"/>
-          <w:szCs w:val="22"/>
-        </w:rPr>
-        <w:t xml:space="preserve">이사회 의사록, 지급결의서, 회계전표, 예산서</w:t>
-      </w:r>
-      <w:r>
-        <w:rPr>
-          <w:rFonts w:ascii="맑은 고딕" w:cs="맑은 고딕" w:eastAsia="맑은 고딕" w:hAnsi="맑은 고딕"/>
-          <w:sz w:val="22"/>
-          <w:szCs w:val="22"/>
-        </w:rPr>
-        <w:t xml:space="preserve"> 확보</w:t>
+          <w:b/>
+          <w:bCs/>
+          <w:sz w:val="22"/>
+          <w:szCs w:val="22"/>
+        </w:rPr>
+        <w:t xml:space="preserve">동시에 이루어진 입장 번복</w:t>
+      </w:r>
+      <w:r>
+        <w:rPr>
+          <w:rFonts w:ascii="맑은 고딕" w:cs="맑은 고딕" w:eastAsia="맑은 고딕" w:hAnsi="맑은 고딕"/>
+          <w:sz w:val="22"/>
+          <w:szCs w:val="22"/>
+        </w:rPr>
+        <w:t xml:space="preserve">: 순정축협은 2023. 1. 17. 공문(증 제3호)에서 위원회를 "인근 5개마을 대표로 구성된 환경개선위원회"라고 하였습니다. 위원회도 2023. 1. 8. 공문(증 제2호)에서 "5개 마을과 마을기업자연가를 대표해서"라고 하였습니다. 그런데 두 단체는 진정인의 자료 요구를 받자 </w:t>
+      </w:r>
+      <w:r>
+        <w:rPr>
+          <w:rFonts w:ascii="맑은 고딕" w:cs="맑은 고딕" w:eastAsia="맑은 고딕" w:hAnsi="맑은 고딕"/>
+          <w:b/>
+          <w:bCs/>
+          <w:sz w:val="22"/>
+          <w:szCs w:val="22"/>
+        </w:rPr>
+        <w:t xml:space="preserve">같은 시기에 함께</w:t>
+      </w:r>
+      <w:r>
+        <w:rPr>
+          <w:rFonts w:ascii="맑은 고딕" w:cs="맑은 고딕" w:eastAsia="맑은 고딕" w:hAnsi="맑은 고딕"/>
+          <w:sz w:val="22"/>
+          <w:szCs w:val="22"/>
+        </w:rPr>
+        <w:t xml:space="preserve"> 위원회를 "자발적으로 구성된(참여한) 주민공동체"로 축소하여 설명하였습니다(위 표 2번).</w:t>
       </w:r>
     </w:p>
     <w:p>
@@ -1551,28 +3391,38 @@
       <w:r>
         <w:rPr>
           <w:rFonts w:ascii="맑은 고딕" w:cs="맑은 고딕" w:eastAsia="맑은 고딕" w:hAnsi="맑은 고딕"/>
-          <w:sz w:val="22"/>
-          <w:szCs w:val="22"/>
-        </w:rPr>
-        <w:t xml:space="preserve">위 금원이 입금된 </w:t>
-      </w:r>
-      <w:r>
-        <w:rPr>
-          <w:rFonts w:ascii="맑은 고딕" w:cs="맑은 고딕" w:eastAsia="맑은 고딕" w:hAnsi="맑은 고딕"/>
-          <w:b/>
-          <w:bCs/>
-          <w:sz w:val="22"/>
-          <w:szCs w:val="22"/>
-        </w:rPr>
-        <w:t xml:space="preserve">계좌의 명의인과 입출금 내역</w:t>
-      </w:r>
-      <w:r>
-        <w:rPr>
-          <w:rFonts w:ascii="맑은 고딕" w:cs="맑은 고딕" w:eastAsia="맑은 고딕" w:hAnsi="맑은 고딕"/>
-          <w:sz w:val="22"/>
-          <w:szCs w:val="22"/>
-        </w:rPr>
-        <w:t xml:space="preserve"> 확인</w:t>
+          <w:b/>
+          <w:bCs/>
+          <w:sz w:val="22"/>
+          <w:szCs w:val="22"/>
+        </w:rPr>
+        <w:t xml:space="preserve">같은 구조와 표현</w:t>
+      </w:r>
+      <w:r>
+        <w:rPr>
+          <w:rFonts w:ascii="맑은 고딕" w:cs="맑은 고딕" w:eastAsia="맑은 고딕" w:hAnsi="맑은 고딕"/>
+          <w:sz w:val="22"/>
+          <w:szCs w:val="22"/>
+        </w:rPr>
+        <w:t xml:space="preserve">: 두 답변서는 진정인의 자격 부정, "당연히 발생하는 것은 아니다"라는 같은 논리, 근거 제시 요구, 유포 중단 요청과 법적 조치 예고, 권리 불포기 맺음말까지 </w:t>
+      </w:r>
+      <w:r>
+        <w:rPr>
+          <w:rFonts w:ascii="맑은 고딕" w:cs="맑은 고딕" w:eastAsia="맑은 고딕" w:hAnsi="맑은 고딕"/>
+          <w:b/>
+          <w:bCs/>
+          <w:sz w:val="22"/>
+          <w:szCs w:val="22"/>
+        </w:rPr>
+        <w:t xml:space="preserve">같은 순서와 같은 표현</w:t>
+      </w:r>
+      <w:r>
+        <w:rPr>
+          <w:rFonts w:ascii="맑은 고딕" w:cs="맑은 고딕" w:eastAsia="맑은 고딕" w:hAnsi="맑은 고딕"/>
+          <w:sz w:val="22"/>
+          <w:szCs w:val="22"/>
+        </w:rPr>
+        <w:t xml:space="preserve">으로 구성되어 있습니다(위 표 3~8번).</w:t>
       </w:r>
     </w:p>
     <w:p>
@@ -1594,28 +3444,38 @@
       <w:r>
         <w:rPr>
           <w:rFonts w:ascii="맑은 고딕" w:cs="맑은 고딕" w:eastAsia="맑은 고딕" w:hAnsi="맑은 고딕"/>
-          <w:sz w:val="22"/>
-          <w:szCs w:val="22"/>
-        </w:rPr>
-        <w:t xml:space="preserve">위원회의 </w:t>
-      </w:r>
-      <w:r>
-        <w:rPr>
-          <w:rFonts w:ascii="맑은 고딕" w:cs="맑은 고딕" w:eastAsia="맑은 고딕" w:hAnsi="맑은 고딕"/>
-          <w:b/>
-          <w:bCs/>
-          <w:sz w:val="22"/>
-          <w:szCs w:val="22"/>
-        </w:rPr>
-        <w:t xml:space="preserve">회칙, 회의록, 회계장부, 집행 증빙</w:t>
-      </w:r>
-      <w:r>
-        <w:rPr>
-          <w:rFonts w:ascii="맑은 고딕" w:cs="맑은 고딕" w:eastAsia="맑은 고딕" w:hAnsi="맑은 고딕"/>
-          <w:sz w:val="22"/>
-          <w:szCs w:val="22"/>
-        </w:rPr>
-        <w:t xml:space="preserve"> 확인</w:t>
+          <w:b/>
+          <w:bCs/>
+          <w:sz w:val="22"/>
+          <w:szCs w:val="22"/>
+        </w:rPr>
+        <w:t xml:space="preserve">서로 떠넘기는 구조</w:t>
+      </w:r>
+      <w:r>
+        <w:rPr>
+          <w:rFonts w:ascii="맑은 고딕" w:cs="맑은 고딕" w:eastAsia="맑은 고딕" w:hAnsi="맑은 고딕"/>
+          <w:sz w:val="22"/>
+          <w:szCs w:val="22"/>
+        </w:rPr>
+        <w:t xml:space="preserve">: 위원회는 "순정축협에 확인하라"고 하였고, 순정축협은 진정인이 수령권자가 아니라며 공개하지 않았습니다. 그 결과 금원의 지급 내역과 사용 내역은 </w:t>
+      </w:r>
+      <w:r>
+        <w:rPr>
+          <w:rFonts w:ascii="맑은 고딕" w:cs="맑은 고딕" w:eastAsia="맑은 고딕" w:hAnsi="맑은 고딕"/>
+          <w:b/>
+          <w:bCs/>
+          <w:sz w:val="22"/>
+          <w:szCs w:val="22"/>
+        </w:rPr>
+        <w:t xml:space="preserve">어느 쪽에서도 확인할 수 없게</w:t>
+      </w:r>
+      <w:r>
+        <w:rPr>
+          <w:rFonts w:ascii="맑은 고딕" w:cs="맑은 고딕" w:eastAsia="맑은 고딕" w:hAnsi="맑은 고딕"/>
+          <w:sz w:val="22"/>
+          <w:szCs w:val="22"/>
+        </w:rPr>
+        <w:t xml:space="preserve"> 되었습니다(위 표 9번).</w:t>
       </w:r>
     </w:p>
     <w:p>
@@ -1637,28 +3497,20 @@
       <w:r>
         <w:rPr>
           <w:rFonts w:ascii="맑은 고딕" w:cs="맑은 고딕" w:eastAsia="맑은 고딕" w:hAnsi="맑은 고딕"/>
-          <w:sz w:val="22"/>
-          <w:szCs w:val="22"/>
-        </w:rPr>
-        <w:t xml:space="preserve">송완복이 받을 수 있었다는 "관련 금원"의 </w:t>
-      </w:r>
-      <w:r>
-        <w:rPr>
-          <w:rFonts w:ascii="맑은 고딕" w:cs="맑은 고딕" w:eastAsia="맑은 고딕" w:hAnsi="맑은 고딕"/>
-          <w:b/>
-          <w:bCs/>
-          <w:sz w:val="22"/>
-          <w:szCs w:val="22"/>
-        </w:rPr>
-        <w:t xml:space="preserve">원래 명목과 근거</w:t>
-      </w:r>
-      <w:r>
-        <w:rPr>
-          <w:rFonts w:ascii="맑은 고딕" w:cs="맑은 고딕" w:eastAsia="맑은 고딕" w:hAnsi="맑은 고딕"/>
-          <w:sz w:val="22"/>
-          <w:szCs w:val="22"/>
-        </w:rPr>
-        <w:t xml:space="preserve">, 그리고 순정축협이 이를 위원회에 지급하게 된 경위 확인 (참고인 조사)</w:t>
+          <w:b/>
+          <w:bCs/>
+          <w:sz w:val="22"/>
+          <w:szCs w:val="22"/>
+        </w:rPr>
+        <w:t xml:space="preserve">연속된 발송</w:t>
+      </w:r>
+      <w:r>
+        <w:rPr>
+          <w:rFonts w:ascii="맑은 고딕" w:cs="맑은 고딕" w:eastAsia="맑은 고딕" w:hAnsi="맑은 고딕"/>
+          <w:sz w:val="22"/>
+          <w:szCs w:val="22"/>
+        </w:rPr>
+        <w:t xml:space="preserve">: 두 답변서는 하루 간격으로 같은 우체국에서 연속된 번호로 발송되었습니다(위 표 1번). 이 점만으로는 공동 작성을 단정할 수 없으나, 위 가~다의 정황과 함께 보면 두 단체가 답변 내용을 사전에 협의하였을 가능성을 뒷받침합니다.</w:t>
       </w:r>
     </w:p>
     <w:p>
@@ -1683,25 +3535,55 @@
           <w:sz w:val="22"/>
           <w:szCs w:val="22"/>
         </w:rPr>
-        <w:t xml:space="preserve">2023. 1.경 협약 체결 전후로 위원회 및 이장들과 순정축협 사이에 오간 </w:t>
-      </w:r>
-      <w:r>
-        <w:rPr>
-          <w:rFonts w:ascii="맑은 고딕" w:cs="맑은 고딕" w:eastAsia="맑은 고딕" w:hAnsi="맑은 고딕"/>
-          <w:b/>
-          <w:bCs/>
-          <w:sz w:val="22"/>
-          <w:szCs w:val="22"/>
-        </w:rPr>
-        <w:t xml:space="preserve">금원 지원 약속과 협약 내용의 관련성</w:t>
-      </w:r>
-      <w:r>
-        <w:rPr>
-          <w:rFonts w:ascii="맑은 고딕" w:cs="맑은 고딕" w:eastAsia="맑은 고딕" w:hAnsi="맑은 고딕"/>
-          <w:sz w:val="22"/>
-          <w:szCs w:val="22"/>
-        </w:rPr>
-        <w:t xml:space="preserve"> 확인</w:t>
+        <w:t xml:space="preserve">진정인은 2026. 10. ____. 위원회에 두 답변서의 작성자, 작성 과정에서의 사전 협의, 작성 비용의 부담 주체를 묻는 내용증명을 보냈으나(증 제10호), [답변 없음 / 다음과 같이 답변함: __________].</w:t>
+      </w:r>
+    </w:p>
+    <w:p>
+      <w:pPr>
+        <w:spacing w:after="120" w:before="0" w:line="380"/>
+        <w:jc w:val="both"/>
+      </w:pPr>
+      <w:r>
+        <w:rPr>
+          <w:rFonts w:ascii="맑은 고딕" w:cs="맑은 고딕" w:eastAsia="맑은 고딕" w:hAnsi="맑은 고딕"/>
+          <w:sz w:val="22"/>
+          <w:szCs w:val="22"/>
+        </w:rPr>
+        <w:t xml:space="preserve">금원을 지급한 쪽과 받은 쪽이 주민의 자료 요구에 대하여 답변 내용을 맞추었다면, 이는 위 4항 나.에서 본 </w:t>
+      </w:r>
+      <w:r>
+        <w:rPr>
+          <w:rFonts w:ascii="맑은 고딕" w:cs="맑은 고딕" w:eastAsia="맑은 고딕" w:hAnsi="맑은 고딕"/>
+          <w:b/>
+          <w:bCs/>
+          <w:sz w:val="22"/>
+          <w:szCs w:val="22"/>
+        </w:rPr>
+        <w:t xml:space="preserve">금원 지급과 협력 약속 사이의 대가 관계</w:t>
+      </w:r>
+      <w:r>
+        <w:rPr>
+          <w:rFonts w:ascii="맑은 고딕" w:cs="맑은 고딕" w:eastAsia="맑은 고딕" w:hAnsi="맑은 고딕"/>
+          <w:sz w:val="22"/>
+          <w:szCs w:val="22"/>
+        </w:rPr>
+        <w:t xml:space="preserve">에 대한 의혹을 더욱 짙게 하는 사정입니다. 아울러 수사 과정에서 관련자들 사이에 진술이나 자료를 맞출 우려가 있으므로, 신속한 자료 확보가 필요합니다.</w:t>
+      </w:r>
+    </w:p>
+    <w:p>
+      <w:pPr>
+        <w:keepNext/>
+        <w:spacing w:after="140" w:before="300"/>
+      </w:pPr>
+      <w:r>
+        <w:rPr>
+          <w:rFonts w:ascii="맑은 고딕" w:cs="맑은 고딕" w:eastAsia="맑은 고딕" w:hAnsi="맑은 고딕"/>
+          <w:b/>
+          <w:bCs/>
+          <w:sz w:val="24"/>
+          <w:szCs w:val="24"/>
+        </w:rPr>
+        <w:t xml:space="preserve">6. 수사 요청 사항</w:t>
       </w:r>
     </w:p>
     <w:p>
@@ -1718,7 +3600,301 @@
           <w:sz w:val="22"/>
           <w:szCs w:val="22"/>
         </w:rPr>
+        <w:t xml:space="preserve">가. </w:t>
+      </w:r>
+      <w:r>
+        <w:rPr>
+          <w:rFonts w:ascii="맑은 고딕" w:cs="맑은 고딕" w:eastAsia="맑은 고딕" w:hAnsi="맑은 고딕"/>
+          <w:sz w:val="22"/>
+          <w:szCs w:val="22"/>
+        </w:rPr>
+        <w:t xml:space="preserve">순정축협의 위 1억 원 지급 관련 </w:t>
+      </w:r>
+      <w:r>
+        <w:rPr>
+          <w:rFonts w:ascii="맑은 고딕" w:cs="맑은 고딕" w:eastAsia="맑은 고딕" w:hAnsi="맑은 고딕"/>
+          <w:b/>
+          <w:bCs/>
+          <w:sz w:val="22"/>
+          <w:szCs w:val="22"/>
+        </w:rPr>
+        <w:t xml:space="preserve">이사회 의사록, 지급결의서, 회계전표, 예산서</w:t>
+      </w:r>
+      <w:r>
+        <w:rPr>
+          <w:rFonts w:ascii="맑은 고딕" w:cs="맑은 고딕" w:eastAsia="맑은 고딕" w:hAnsi="맑은 고딕"/>
+          <w:sz w:val="22"/>
+          <w:szCs w:val="22"/>
+        </w:rPr>
+        <w:t xml:space="preserve"> 확보</w:t>
+      </w:r>
+    </w:p>
+    <w:p>
+      <w:pPr>
+        <w:spacing w:after="100" w:line="370"/>
+        <w:ind w:left="400" w:hanging="400"/>
+        <w:jc w:val="both"/>
+      </w:pPr>
+      <w:r>
+        <w:rPr>
+          <w:rFonts w:ascii="맑은 고딕" w:cs="맑은 고딕" w:eastAsia="맑은 고딕" w:hAnsi="맑은 고딕"/>
+          <w:b/>
+          <w:bCs/>
+          <w:sz w:val="22"/>
+          <w:szCs w:val="22"/>
+        </w:rPr>
+        <w:t xml:space="preserve">나. </w:t>
+      </w:r>
+      <w:r>
+        <w:rPr>
+          <w:rFonts w:ascii="맑은 고딕" w:cs="맑은 고딕" w:eastAsia="맑은 고딕" w:hAnsi="맑은 고딕"/>
+          <w:sz w:val="22"/>
+          <w:szCs w:val="22"/>
+        </w:rPr>
+        <w:t xml:space="preserve">위 금원이 입금된 </w:t>
+      </w:r>
+      <w:r>
+        <w:rPr>
+          <w:rFonts w:ascii="맑은 고딕" w:cs="맑은 고딕" w:eastAsia="맑은 고딕" w:hAnsi="맑은 고딕"/>
+          <w:b/>
+          <w:bCs/>
+          <w:sz w:val="22"/>
+          <w:szCs w:val="22"/>
+        </w:rPr>
+        <w:t xml:space="preserve">계좌의 명의인과 입출금 내역</w:t>
+      </w:r>
+      <w:r>
+        <w:rPr>
+          <w:rFonts w:ascii="맑은 고딕" w:cs="맑은 고딕" w:eastAsia="맑은 고딕" w:hAnsi="맑은 고딕"/>
+          <w:sz w:val="22"/>
+          <w:szCs w:val="22"/>
+        </w:rPr>
+        <w:t xml:space="preserve"> 확인</w:t>
+      </w:r>
+    </w:p>
+    <w:p>
+      <w:pPr>
+        <w:spacing w:after="100" w:line="370"/>
+        <w:ind w:left="400" w:hanging="400"/>
+        <w:jc w:val="both"/>
+      </w:pPr>
+      <w:r>
+        <w:rPr>
+          <w:rFonts w:ascii="맑은 고딕" w:cs="맑은 고딕" w:eastAsia="맑은 고딕" w:hAnsi="맑은 고딕"/>
+          <w:b/>
+          <w:bCs/>
+          <w:sz w:val="22"/>
+          <w:szCs w:val="22"/>
+        </w:rPr>
+        <w:t xml:space="preserve">다. </w:t>
+      </w:r>
+      <w:r>
+        <w:rPr>
+          <w:rFonts w:ascii="맑은 고딕" w:cs="맑은 고딕" w:eastAsia="맑은 고딕" w:hAnsi="맑은 고딕"/>
+          <w:sz w:val="22"/>
+          <w:szCs w:val="22"/>
+        </w:rPr>
+        <w:t xml:space="preserve">위원회의 </w:t>
+      </w:r>
+      <w:r>
+        <w:rPr>
+          <w:rFonts w:ascii="맑은 고딕" w:cs="맑은 고딕" w:eastAsia="맑은 고딕" w:hAnsi="맑은 고딕"/>
+          <w:b/>
+          <w:bCs/>
+          <w:sz w:val="22"/>
+          <w:szCs w:val="22"/>
+        </w:rPr>
+        <w:t xml:space="preserve">회칙, 회의록, 회계장부, 집행 증빙</w:t>
+      </w:r>
+      <w:r>
+        <w:rPr>
+          <w:rFonts w:ascii="맑은 고딕" w:cs="맑은 고딕" w:eastAsia="맑은 고딕" w:hAnsi="맑은 고딕"/>
+          <w:sz w:val="22"/>
+          <w:szCs w:val="22"/>
+        </w:rPr>
+        <w:t xml:space="preserve"> 확인</w:t>
+      </w:r>
+    </w:p>
+    <w:p>
+      <w:pPr>
+        <w:spacing w:after="100" w:line="370"/>
+        <w:ind w:left="400" w:hanging="400"/>
+        <w:jc w:val="both"/>
+      </w:pPr>
+      <w:r>
+        <w:rPr>
+          <w:rFonts w:ascii="맑은 고딕" w:cs="맑은 고딕" w:eastAsia="맑은 고딕" w:hAnsi="맑은 고딕"/>
+          <w:b/>
+          <w:bCs/>
+          <w:sz w:val="22"/>
+          <w:szCs w:val="22"/>
+        </w:rPr>
+        <w:t xml:space="preserve">라. </w:t>
+      </w:r>
+      <w:r>
+        <w:rPr>
+          <w:rFonts w:ascii="맑은 고딕" w:cs="맑은 고딕" w:eastAsia="맑은 고딕" w:hAnsi="맑은 고딕"/>
+          <w:sz w:val="22"/>
+          <w:szCs w:val="22"/>
+        </w:rPr>
+        <w:t xml:space="preserve">송완복이 받을 수 있었다는 "관련 금원"의 </w:t>
+      </w:r>
+      <w:r>
+        <w:rPr>
+          <w:rFonts w:ascii="맑은 고딕" w:cs="맑은 고딕" w:eastAsia="맑은 고딕" w:hAnsi="맑은 고딕"/>
+          <w:b/>
+          <w:bCs/>
+          <w:sz w:val="22"/>
+          <w:szCs w:val="22"/>
+        </w:rPr>
+        <w:t xml:space="preserve">원래 명목과 근거</w:t>
+      </w:r>
+      <w:r>
+        <w:rPr>
+          <w:rFonts w:ascii="맑은 고딕" w:cs="맑은 고딕" w:eastAsia="맑은 고딕" w:hAnsi="맑은 고딕"/>
+          <w:sz w:val="22"/>
+          <w:szCs w:val="22"/>
+        </w:rPr>
+        <w:t xml:space="preserve">, 그리고 순정축협이 이를 위원회에 지급하게 된 경위 확인 (참고인 조사)</w:t>
+      </w:r>
+    </w:p>
+    <w:p>
+      <w:pPr>
+        <w:spacing w:after="100" w:line="370"/>
+        <w:ind w:left="400" w:hanging="400"/>
+        <w:jc w:val="both"/>
+      </w:pPr>
+      <w:r>
+        <w:rPr>
+          <w:rFonts w:ascii="맑은 고딕" w:cs="맑은 고딕" w:eastAsia="맑은 고딕" w:hAnsi="맑은 고딕"/>
+          <w:b/>
+          <w:bCs/>
+          <w:sz w:val="22"/>
+          <w:szCs w:val="22"/>
+        </w:rPr>
+        <w:t xml:space="preserve">마. </w:t>
+      </w:r>
+      <w:r>
+        <w:rPr>
+          <w:rFonts w:ascii="맑은 고딕" w:cs="맑은 고딕" w:eastAsia="맑은 고딕" w:hAnsi="맑은 고딕"/>
+          <w:sz w:val="22"/>
+          <w:szCs w:val="22"/>
+        </w:rPr>
+        <w:t xml:space="preserve">2023. 1.경 협약 체결 전후로 위원회 및 이장들과 순정축협 사이에 오간 </w:t>
+      </w:r>
+      <w:r>
+        <w:rPr>
+          <w:rFonts w:ascii="맑은 고딕" w:cs="맑은 고딕" w:eastAsia="맑은 고딕" w:hAnsi="맑은 고딕"/>
+          <w:b/>
+          <w:bCs/>
+          <w:sz w:val="22"/>
+          <w:szCs w:val="22"/>
+        </w:rPr>
+        <w:t xml:space="preserve">금원 지원 약속과 협약 내용의 관련성</w:t>
+      </w:r>
+      <w:r>
+        <w:rPr>
+          <w:rFonts w:ascii="맑은 고딕" w:cs="맑은 고딕" w:eastAsia="맑은 고딕" w:hAnsi="맑은 고딕"/>
+          <w:sz w:val="22"/>
+          <w:szCs w:val="22"/>
+        </w:rPr>
+        <w:t xml:space="preserve"> 확인</w:t>
+      </w:r>
+    </w:p>
+    <w:p>
+      <w:pPr>
+        <w:spacing w:after="100" w:line="370"/>
+        <w:ind w:left="400" w:hanging="400"/>
+        <w:jc w:val="both"/>
+      </w:pPr>
+      <w:r>
+        <w:rPr>
+          <w:rFonts w:ascii="맑은 고딕" w:cs="맑은 고딕" w:eastAsia="맑은 고딕" w:hAnsi="맑은 고딕"/>
+          <w:b/>
+          <w:bCs/>
+          <w:sz w:val="22"/>
+          <w:szCs w:val="22"/>
+        </w:rPr>
         <w:t xml:space="preserve">바. </w:t>
+      </w:r>
+      <w:r>
+        <w:rPr>
+          <w:rFonts w:ascii="맑은 고딕" w:cs="맑은 고딕" w:eastAsia="맑은 고딕" w:hAnsi="맑은 고딕"/>
+          <w:sz w:val="22"/>
+          <w:szCs w:val="22"/>
+        </w:rPr>
+        <w:t xml:space="preserve">위원회와 순정축협의 2026. 9.자 </w:t>
+      </w:r>
+      <w:r>
+        <w:rPr>
+          <w:rFonts w:ascii="맑은 고딕" w:cs="맑은 고딕" w:eastAsia="맑은 고딕" w:hAnsi="맑은 고딕"/>
+          <w:b/>
+          <w:bCs/>
+          <w:sz w:val="22"/>
+          <w:szCs w:val="22"/>
+        </w:rPr>
+        <w:t xml:space="preserve">답변서 작성자와 작성 경위</w:t>
+      </w:r>
+      <w:r>
+        <w:rPr>
+          <w:rFonts w:ascii="맑은 고딕" w:cs="맑은 고딕" w:eastAsia="맑은 고딕" w:hAnsi="맑은 고딕"/>
+          <w:sz w:val="22"/>
+          <w:szCs w:val="22"/>
+        </w:rPr>
+        <w:t xml:space="preserve">, 두 단체 사이의 </w:t>
+      </w:r>
+      <w:r>
+        <w:rPr>
+          <w:rFonts w:ascii="맑은 고딕" w:cs="맑은 고딕" w:eastAsia="맑은 고딕" w:hAnsi="맑은 고딕"/>
+          <w:b/>
+          <w:bCs/>
+          <w:sz w:val="22"/>
+          <w:szCs w:val="22"/>
+        </w:rPr>
+        <w:t xml:space="preserve">사전 협의 여부</w:t>
+      </w:r>
+      <w:r>
+        <w:rPr>
+          <w:rFonts w:ascii="맑은 고딕" w:cs="맑은 고딕" w:eastAsia="맑은 고딕" w:hAnsi="맑은 고딕"/>
+          <w:sz w:val="22"/>
+          <w:szCs w:val="22"/>
+        </w:rPr>
+        <w:t xml:space="preserve">(연락 내역 포함), 그리고 답변서 작성 비용(법률 자문료 등)의 </w:t>
+      </w:r>
+      <w:r>
+        <w:rPr>
+          <w:rFonts w:ascii="맑은 고딕" w:cs="맑은 고딕" w:eastAsia="맑은 고딕" w:hAnsi="맑은 고딕"/>
+          <w:b/>
+          <w:bCs/>
+          <w:sz w:val="22"/>
+          <w:szCs w:val="22"/>
+        </w:rPr>
+        <w:t xml:space="preserve">부담 주체</w:t>
+      </w:r>
+      <w:r>
+        <w:rPr>
+          <w:rFonts w:ascii="맑은 고딕" w:cs="맑은 고딕" w:eastAsia="맑은 고딕" w:hAnsi="맑은 고딕"/>
+          <w:sz w:val="22"/>
+          <w:szCs w:val="22"/>
+        </w:rPr>
+        <w:t xml:space="preserve">와 그 비용이 위 금원에서 지출되었는지 여부 확인</w:t>
+      </w:r>
+    </w:p>
+    <w:p>
+      <w:pPr>
+        <w:spacing w:after="100" w:line="370"/>
+        <w:ind w:left="400" w:hanging="400"/>
+        <w:jc w:val="both"/>
+      </w:pPr>
+      <w:r>
+        <w:rPr>
+          <w:rFonts w:ascii="맑은 고딕" w:cs="맑은 고딕" w:eastAsia="맑은 고딕" w:hAnsi="맑은 고딕"/>
+          <w:b/>
+          <w:bCs/>
+          <w:sz w:val="22"/>
+          <w:szCs w:val="22"/>
+        </w:rPr>
+        <w:t xml:space="preserve">사. </w:t>
       </w:r>
       <w:r>
         <w:rPr>
@@ -1742,7 +3918,7 @@
           <w:sz w:val="24"/>
           <w:szCs w:val="24"/>
         </w:rPr>
-        <w:t xml:space="preserve">6. 맺음말</w:t>
+        <w:t xml:space="preserve">7. 맺음말</w:t>
       </w:r>
     </w:p>
     <w:p>
@@ -2763,6 +4939,330 @@
                 <w:szCs w:val="20"/>
               </w:rPr>
               <w:t xml:space="preserve">해당 시</w:t>
+            </w:r>
+          </w:p>
+        </w:tc>
+      </w:tr>
+      <w:tr>
+        <w:trPr>
+          <w:cantSplit/>
+          <w:tblHeader w:val="off"/>
+        </w:trPr>
+        <w:tc>
+          <w:tcPr>
+            <w:tcW w:type="dxa" w:w="1200"/>
+            <w:tcBorders>
+              <w:top w:val="single" w:color="808080" w:sz="4"/>
+              <w:left w:val="single" w:color="808080" w:sz="4"/>
+              <w:bottom w:val="single" w:color="808080" w:sz="4"/>
+              <w:right w:val="single" w:color="808080" w:sz="4"/>
+            </w:tcBorders>
+            <w:tcMar>
+              <w:top w:type="dxa" w:w="80"/>
+              <w:left w:type="dxa" w:w="110"/>
+              <w:bottom w:type="dxa" w:w="80"/>
+              <w:right w:type="dxa" w:w="110"/>
+            </w:tcMar>
+            <w:vAlign w:val="center"/>
+          </w:tcPr>
+          <w:p>
+            <w:pPr>
+              <w:spacing w:line="320"/>
+              <w:jc w:val="left"/>
+            </w:pPr>
+            <w:r>
+              <w:rPr>
+                <w:rFonts w:ascii="맑은 고딕" w:cs="맑은 고딕" w:eastAsia="맑은 고딕" w:hAnsi="맑은 고딕"/>
+                <w:b w:val="false"/>
+                <w:bCs w:val="false"/>
+                <w:sz w:val="20"/>
+                <w:szCs w:val="20"/>
+              </w:rPr>
+              <w:t xml:space="preserve">증 제9호</w:t>
+            </w:r>
+          </w:p>
+        </w:tc>
+        <w:tc>
+          <w:tcPr>
+            <w:tcW w:type="dxa" w:w="6038"/>
+            <w:tcBorders>
+              <w:top w:val="single" w:color="808080" w:sz="4"/>
+              <w:left w:val="single" w:color="808080" w:sz="4"/>
+              <w:bottom w:val="single" w:color="808080" w:sz="4"/>
+              <w:right w:val="single" w:color="808080" w:sz="4"/>
+            </w:tcBorders>
+            <w:tcMar>
+              <w:top w:type="dxa" w:w="80"/>
+              <w:left w:type="dxa" w:w="110"/>
+              <w:bottom w:type="dxa" w:w="80"/>
+              <w:right w:type="dxa" w:w="110"/>
+            </w:tcMar>
+            <w:vAlign w:val="center"/>
+          </w:tcPr>
+          <w:p>
+            <w:pPr>
+              <w:spacing w:line="320"/>
+              <w:jc w:val="left"/>
+            </w:pPr>
+            <w:r>
+              <w:rPr>
+                <w:rFonts w:ascii="맑은 고딕" w:cs="맑은 고딕" w:eastAsia="맑은 고딕" w:hAnsi="맑은 고딕"/>
+                <w:b w:val="false"/>
+                <w:bCs w:val="false"/>
+                <w:sz w:val="20"/>
+                <w:szCs w:val="20"/>
+              </w:rPr>
+              <w:t xml:space="preserve">위원회 답변서와 순정축협 답변서 대조표 (9개 항목)</w:t>
+            </w:r>
+          </w:p>
+        </w:tc>
+        <w:tc>
+          <w:tcPr>
+            <w:tcW w:type="dxa" w:w="2400"/>
+            <w:tcBorders>
+              <w:top w:val="single" w:color="808080" w:sz="4"/>
+              <w:left w:val="single" w:color="808080" w:sz="4"/>
+              <w:bottom w:val="single" w:color="808080" w:sz="4"/>
+              <w:right w:val="single" w:color="808080" w:sz="4"/>
+            </w:tcBorders>
+            <w:tcMar>
+              <w:top w:type="dxa" w:w="80"/>
+              <w:left w:type="dxa" w:w="110"/>
+              <w:bottom w:type="dxa" w:w="80"/>
+              <w:right w:type="dxa" w:w="110"/>
+            </w:tcMar>
+            <w:vAlign w:val="center"/>
+          </w:tcPr>
+          <w:p>
+            <w:pPr>
+              <w:spacing w:line="320"/>
+              <w:jc w:val="left"/>
+            </w:pPr>
+            <w:r>
+              <w:rPr>
+                <w:rFonts w:ascii="맑은 고딕" w:cs="맑은 고딕" w:eastAsia="맑은 고딕" w:hAnsi="맑은 고딕"/>
+                <w:b w:val="false"/>
+                <w:bCs w:val="false"/>
+                <w:sz w:val="20"/>
+                <w:szCs w:val="20"/>
+              </w:rPr>
+              <w:t xml:space="preserve">진정인 작성</w:t>
+            </w:r>
+          </w:p>
+        </w:tc>
+      </w:tr>
+      <w:tr>
+        <w:trPr>
+          <w:cantSplit/>
+          <w:tblHeader w:val="off"/>
+        </w:trPr>
+        <w:tc>
+          <w:tcPr>
+            <w:tcW w:type="dxa" w:w="1200"/>
+            <w:tcBorders>
+              <w:top w:val="single" w:color="808080" w:sz="4"/>
+              <w:left w:val="single" w:color="808080" w:sz="4"/>
+              <w:bottom w:val="single" w:color="808080" w:sz="4"/>
+              <w:right w:val="single" w:color="808080" w:sz="4"/>
+            </w:tcBorders>
+            <w:tcMar>
+              <w:top w:type="dxa" w:w="80"/>
+              <w:left w:type="dxa" w:w="110"/>
+              <w:bottom w:type="dxa" w:w="80"/>
+              <w:right w:type="dxa" w:w="110"/>
+            </w:tcMar>
+            <w:vAlign w:val="center"/>
+          </w:tcPr>
+          <w:p>
+            <w:pPr>
+              <w:spacing w:line="320"/>
+              <w:jc w:val="left"/>
+            </w:pPr>
+            <w:r>
+              <w:rPr>
+                <w:rFonts w:ascii="맑은 고딕" w:cs="맑은 고딕" w:eastAsia="맑은 고딕" w:hAnsi="맑은 고딕"/>
+                <w:b w:val="false"/>
+                <w:bCs w:val="false"/>
+                <w:sz w:val="20"/>
+                <w:szCs w:val="20"/>
+              </w:rPr>
+              <w:t xml:space="preserve">증 제10호</w:t>
+            </w:r>
+          </w:p>
+        </w:tc>
+        <w:tc>
+          <w:tcPr>
+            <w:tcW w:type="dxa" w:w="6038"/>
+            <w:tcBorders>
+              <w:top w:val="single" w:color="808080" w:sz="4"/>
+              <w:left w:val="single" w:color="808080" w:sz="4"/>
+              <w:bottom w:val="single" w:color="808080" w:sz="4"/>
+              <w:right w:val="single" w:color="808080" w:sz="4"/>
+            </w:tcBorders>
+            <w:tcMar>
+              <w:top w:type="dxa" w:w="80"/>
+              <w:left w:type="dxa" w:w="110"/>
+              <w:bottom w:type="dxa" w:w="80"/>
+              <w:right w:type="dxa" w:w="110"/>
+            </w:tcMar>
+            <w:vAlign w:val="center"/>
+          </w:tcPr>
+          <w:p>
+            <w:pPr>
+              <w:spacing w:line="320"/>
+              <w:jc w:val="left"/>
+            </w:pPr>
+            <w:r>
+              <w:rPr>
+                <w:rFonts w:ascii="맑은 고딕" w:cs="맑은 고딕" w:eastAsia="맑은 고딕" w:hAnsi="맑은 고딕"/>
+                <w:b w:val="false"/>
+                <w:bCs w:val="false"/>
+                <w:sz w:val="20"/>
+                <w:szCs w:val="20"/>
+              </w:rPr>
+              <w:t xml:space="preserve">2026. 10. ____.자 진정인의 「답변서 작성 경위에 관한 질의 및 경고」 내용증명 및 그에 대한 답변</w:t>
+            </w:r>
+          </w:p>
+        </w:tc>
+        <w:tc>
+          <w:tcPr>
+            <w:tcW w:type="dxa" w:w="2400"/>
+            <w:tcBorders>
+              <w:top w:val="single" w:color="808080" w:sz="4"/>
+              <w:left w:val="single" w:color="808080" w:sz="4"/>
+              <w:bottom w:val="single" w:color="808080" w:sz="4"/>
+              <w:right w:val="single" w:color="808080" w:sz="4"/>
+            </w:tcBorders>
+            <w:tcMar>
+              <w:top w:type="dxa" w:w="80"/>
+              <w:left w:type="dxa" w:w="110"/>
+              <w:bottom w:type="dxa" w:w="80"/>
+              <w:right w:type="dxa" w:w="110"/>
+            </w:tcMar>
+            <w:vAlign w:val="center"/>
+          </w:tcPr>
+          <w:p>
+            <w:pPr>
+              <w:spacing w:line="320"/>
+              <w:jc w:val="left"/>
+            </w:pPr>
+            <w:r>
+              <w:rPr>
+                <w:rFonts w:ascii="맑은 고딕" w:cs="맑은 고딕" w:eastAsia="맑은 고딕" w:hAnsi="맑은 고딕"/>
+                <w:b w:val="false"/>
+                <w:bCs w:val="false"/>
+                <w:sz w:val="20"/>
+                <w:szCs w:val="20"/>
+              </w:rPr>
+              <w:t xml:space="preserve">해당 시</w:t>
+            </w:r>
+          </w:p>
+        </w:tc>
+      </w:tr>
+      <w:tr>
+        <w:trPr>
+          <w:cantSplit/>
+          <w:tblHeader w:val="off"/>
+        </w:trPr>
+        <w:tc>
+          <w:tcPr>
+            <w:tcW w:type="dxa" w:w="1200"/>
+            <w:tcBorders>
+              <w:top w:val="single" w:color="808080" w:sz="4"/>
+              <w:left w:val="single" w:color="808080" w:sz="4"/>
+              <w:bottom w:val="single" w:color="808080" w:sz="4"/>
+              <w:right w:val="single" w:color="808080" w:sz="4"/>
+            </w:tcBorders>
+            <w:tcMar>
+              <w:top w:type="dxa" w:w="80"/>
+              <w:left w:type="dxa" w:w="110"/>
+              <w:bottom w:type="dxa" w:w="80"/>
+              <w:right w:type="dxa" w:w="110"/>
+            </w:tcMar>
+            <w:vAlign w:val="center"/>
+          </w:tcPr>
+          <w:p>
+            <w:pPr>
+              <w:spacing w:line="320"/>
+              <w:jc w:val="left"/>
+            </w:pPr>
+            <w:r>
+              <w:rPr>
+                <w:rFonts w:ascii="맑은 고딕" w:cs="맑은 고딕" w:eastAsia="맑은 고딕" w:hAnsi="맑은 고딕"/>
+                <w:b w:val="false"/>
+                <w:bCs w:val="false"/>
+                <w:sz w:val="20"/>
+                <w:szCs w:val="20"/>
+              </w:rPr>
+              <w:t xml:space="preserve">증 제11호</w:t>
+            </w:r>
+          </w:p>
+        </w:tc>
+        <w:tc>
+          <w:tcPr>
+            <w:tcW w:type="dxa" w:w="6038"/>
+            <w:tcBorders>
+              <w:top w:val="single" w:color="808080" w:sz="4"/>
+              <w:left w:val="single" w:color="808080" w:sz="4"/>
+              <w:bottom w:val="single" w:color="808080" w:sz="4"/>
+              <w:right w:val="single" w:color="808080" w:sz="4"/>
+            </w:tcBorders>
+            <w:tcMar>
+              <w:top w:type="dxa" w:w="80"/>
+              <w:left w:type="dxa" w:w="110"/>
+              <w:bottom w:type="dxa" w:w="80"/>
+              <w:right w:type="dxa" w:w="110"/>
+            </w:tcMar>
+            <w:vAlign w:val="center"/>
+          </w:tcPr>
+          <w:p>
+            <w:pPr>
+              <w:spacing w:line="320"/>
+              <w:jc w:val="left"/>
+            </w:pPr>
+            <w:r>
+              <w:rPr>
+                <w:rFonts w:ascii="맑은 고딕" w:cs="맑은 고딕" w:eastAsia="맑은 고딕" w:hAnsi="맑은 고딕"/>
+                <w:b w:val="false"/>
+                <w:bCs w:val="false"/>
+                <w:sz w:val="20"/>
+                <w:szCs w:val="20"/>
+              </w:rPr>
+              <w:t xml:space="preserve">두 답변서의 우체국 내용증명 발송 증명 부분 (제3590303000069호, 제3590303000070호)</w:t>
+            </w:r>
+          </w:p>
+        </w:tc>
+        <w:tc>
+          <w:tcPr>
+            <w:tcW w:type="dxa" w:w="2400"/>
+            <w:tcBorders>
+              <w:top w:val="single" w:color="808080" w:sz="4"/>
+              <w:left w:val="single" w:color="808080" w:sz="4"/>
+              <w:bottom w:val="single" w:color="808080" w:sz="4"/>
+              <w:right w:val="single" w:color="808080" w:sz="4"/>
+            </w:tcBorders>
+            <w:tcMar>
+              <w:top w:type="dxa" w:w="80"/>
+              <w:left w:type="dxa" w:w="110"/>
+              <w:bottom w:type="dxa" w:w="80"/>
+              <w:right w:type="dxa" w:w="110"/>
+            </w:tcMar>
+            <w:vAlign w:val="center"/>
+          </w:tcPr>
+          <w:p>
+            <w:pPr>
+              <w:spacing w:line="320"/>
+              <w:jc w:val="left"/>
+            </w:pPr>
+            <w:r>
+              <w:rPr>
+                <w:rFonts w:ascii="맑은 고딕" w:cs="맑은 고딕" w:eastAsia="맑은 고딕" w:hAnsi="맑은 고딕"/>
+                <w:b w:val="false"/>
+                <w:bCs w:val="false"/>
+                <w:sz w:val="20"/>
+                <w:szCs w:val="20"/>
+              </w:rPr>
+              <w:t xml:space="preserve">원본 대조 사본</w:t>
             </w:r>
           </w:p>
         </w:tc>

</xml_diff>

<commit_message>
Petition: add resident opinion-collection signatures (evidence 12)
Co-Authored-By: Claude Opus 5.5 <noreply@anthropic.com>
Claude-Session: https://claude.ai/code/session_01H9b7FFp3sXnkbpWqGcr2Bw
</commit_message>
<xml_diff>
--- a/수사의뢰_진정서.docx
+++ b/수사의뢰_진정서.docx
@@ -1072,22 +1072,6 @@
     </w:p>
     <w:p>
       <w:pPr>
-        <w:keepNext/>
-        <w:spacing w:after="140" w:before="300"/>
-      </w:pPr>
-      <w:r>
-        <w:rPr>
-          <w:rFonts w:ascii="맑은 고딕" w:cs="맑은 고딕" w:eastAsia="맑은 고딕" w:hAnsi="맑은 고딕"/>
-          <w:b/>
-          <w:bCs/>
-          <w:sz w:val="24"/>
-          <w:szCs w:val="24"/>
-        </w:rPr>
-        <w:t xml:space="preserve">3. 순정축협이 위원회에 1억 원을 지급하였다고 밝힌 사실</w:t>
-      </w:r>
-    </w:p>
-    <w:p>
-      <w:pPr>
         <w:spacing w:after="100" w:line="370"/>
         <w:ind w:left="400" w:hanging="400"/>
         <w:jc w:val="both"/>
@@ -1100,6 +1084,118 @@
           <w:sz w:val="22"/>
           <w:szCs w:val="22"/>
         </w:rPr>
+        <w:t xml:space="preserve">바. </w:t>
+      </w:r>
+      <w:r>
+        <w:rPr>
+          <w:rFonts w:ascii="맑은 고딕" w:cs="맑은 고딕" w:eastAsia="맑은 고딕" w:hAnsi="맑은 고딕"/>
+          <w:b/>
+          <w:bCs/>
+          <w:sz w:val="22"/>
+          <w:szCs w:val="22"/>
+        </w:rPr>
+        <w:t xml:space="preserve">행정절차에서도 주민 대표로 의견을 제출하였습니다.</w:t>
+      </w:r>
+      <w:r>
+        <w:rPr>
+          <w:rFonts w:ascii="맑은 고딕" w:cs="맑은 고딕" w:eastAsia="맑은 고딕" w:hAnsi="맑은 고딕"/>
+          <w:sz w:val="22"/>
+          <w:szCs w:val="22"/>
+        </w:rPr>
+        <w:t xml:space="preserve"> 순정축협이 공동자원화센터의 [신축 시설명: __________] 신축을 추진할 때, 정읍시 건축 담당 부서의 요청에 따라 감곡면장이 주민의견을 수렴하였습니다. 감곡면장은 그 결과를 [20__. __. __.자, 문서번호: __________] 공문으로 회신하였습니다(증 제12호). 위 공문에 첨부된 의견서에는 위원회 위원장 박철용, 마을기업 자연가 대표, 그리고 5개 마을 이장 등 </w:t>
+      </w:r>
+      <w:r>
+        <w:rPr>
+          <w:rFonts w:ascii="맑은 고딕" w:cs="맑은 고딕" w:eastAsia="맑은 고딕" w:hAnsi="맑은 고딕"/>
+          <w:b/>
+          <w:bCs/>
+          <w:sz w:val="22"/>
+          <w:szCs w:val="22"/>
+        </w:rPr>
+        <w:t xml:space="preserve">위원회 측 7명이 "반대의견 없음"에 서명</w:t>
+      </w:r>
+      <w:r>
+        <w:rPr>
+          <w:rFonts w:ascii="맑은 고딕" w:cs="맑은 고딕" w:eastAsia="맑은 고딕" w:hAnsi="맑은 고딕"/>
+          <w:sz w:val="22"/>
+          <w:szCs w:val="22"/>
+        </w:rPr>
+        <w:t xml:space="preserve">하였습니다.</w:t>
+      </w:r>
+    </w:p>
+    <w:p>
+      <w:pPr>
+        <w:spacing w:after="100" w:line="370"/>
+        <w:ind w:left="400" w:hanging="400"/>
+        <w:jc w:val="both"/>
+      </w:pPr>
+      <w:r>
+        <w:rPr>
+          <w:rFonts w:ascii="맑은 고딕" w:cs="맑은 고딕" w:eastAsia="맑은 고딕" w:hAnsi="맑은 고딕"/>
+          <w:b/>
+          <w:bCs/>
+          <w:sz w:val="22"/>
+          <w:szCs w:val="22"/>
+        </w:rPr>
+        <w:t xml:space="preserve"> </w:t>
+      </w:r>
+      <w:r>
+        <w:rPr>
+          <w:rFonts w:ascii="맑은 고딕" w:cs="맑은 고딕" w:eastAsia="맑은 고딕" w:hAnsi="맑은 고딕"/>
+          <w:sz w:val="22"/>
+          <w:szCs w:val="22"/>
+        </w:rPr>
+        <w:t xml:space="preserve">즉 위원회 측 7명은 사적인 협약에서뿐 아니라 </w:t>
+      </w:r>
+      <w:r>
+        <w:rPr>
+          <w:rFonts w:ascii="맑은 고딕" w:cs="맑은 고딕" w:eastAsia="맑은 고딕" w:hAnsi="맑은 고딕"/>
+          <w:b/>
+          <w:bCs/>
+          <w:sz w:val="22"/>
+          <w:szCs w:val="22"/>
+        </w:rPr>
+        <w:t xml:space="preserve">행정기관의 공식 주민의견수렴 절차에서도 각 마을 주민을 대표하는 지위</w:t>
+      </w:r>
+      <w:r>
+        <w:rPr>
+          <w:rFonts w:ascii="맑은 고딕" w:cs="맑은 고딕" w:eastAsia="맑은 고딕" w:hAnsi="맑은 고딕"/>
+          <w:sz w:val="22"/>
+          <w:szCs w:val="22"/>
+        </w:rPr>
+        <w:t xml:space="preserve">로 의견을 낸 것입니다. 이는 위원회가 "자발적 민간 공동체"에 불과하다는 2026년 두 단체의 설명(아래 5항)과 정면으로 어긋납니다.</w:t>
+      </w:r>
+    </w:p>
+    <w:p>
+      <w:pPr>
+        <w:keepNext/>
+        <w:spacing w:after="140" w:before="300"/>
+      </w:pPr>
+      <w:r>
+        <w:rPr>
+          <w:rFonts w:ascii="맑은 고딕" w:cs="맑은 고딕" w:eastAsia="맑은 고딕" w:hAnsi="맑은 고딕"/>
+          <w:b/>
+          <w:bCs/>
+          <w:sz w:val="24"/>
+          <w:szCs w:val="24"/>
+        </w:rPr>
+        <w:t xml:space="preserve">3. 순정축협이 위원회에 1억 원을 지급하였다고 밝힌 사실</w:t>
+      </w:r>
+    </w:p>
+    <w:p>
+      <w:pPr>
+        <w:spacing w:after="100" w:line="370"/>
+        <w:ind w:left="400" w:hanging="400"/>
+        <w:jc w:val="both"/>
+      </w:pPr>
+      <w:r>
+        <w:rPr>
+          <w:rFonts w:ascii="맑은 고딕" w:cs="맑은 고딕" w:eastAsia="맑은 고딕" w:hAnsi="맑은 고딕"/>
+          <w:b/>
+          <w:bCs/>
+          <w:sz w:val="22"/>
+          <w:szCs w:val="22"/>
+        </w:rPr>
         <w:t xml:space="preserve">가. </w:t>
       </w:r>
       <w:r>
@@ -1393,6 +1489,74 @@
           <w:szCs w:val="22"/>
         </w:rPr>
         <w:t xml:space="preserve">가 있었는지 확인하여 주시기 바랍니다.</w:t>
+      </w:r>
+    </w:p>
+    <w:p>
+      <w:pPr>
+        <w:spacing w:after="120" w:before="0" w:line="380"/>
+        <w:jc w:val="both"/>
+      </w:pPr>
+      <w:r>
+        <w:rPr>
+          <w:rFonts w:ascii="맑은 고딕" w:cs="맑은 고딕" w:eastAsia="맑은 고딕" w:hAnsi="맑은 고딕"/>
+          <w:sz w:val="22"/>
+          <w:szCs w:val="22"/>
+        </w:rPr>
+        <w:t xml:space="preserve">특히 위원회 측 7명은 순정축협의 시설 신축에 관한 행정청의 주민의견수렴에서 </w:t>
+      </w:r>
+      <w:r>
+        <w:rPr>
+          <w:rFonts w:ascii="맑은 고딕" w:cs="맑은 고딕" w:eastAsia="맑은 고딕" w:hAnsi="맑은 고딕"/>
+          <w:b/>
+          <w:bCs/>
+          <w:sz w:val="22"/>
+          <w:szCs w:val="22"/>
+        </w:rPr>
+        <w:t xml:space="preserve">"반대의견 없음"에 서명</w:t>
+      </w:r>
+      <w:r>
+        <w:rPr>
+          <w:rFonts w:ascii="맑은 고딕" w:cs="맑은 고딕" w:eastAsia="맑은 고딕" w:hAnsi="맑은 고딕"/>
+          <w:sz w:val="22"/>
+          <w:szCs w:val="22"/>
+        </w:rPr>
+        <w:t xml:space="preserve">하였습니다(위 2항 바., 증 제12호). 주민 대표로서 행정청에 낸 이 의견이 순정축협의 금원 지급과 </w:t>
+      </w:r>
+      <w:r>
+        <w:rPr>
+          <w:rFonts w:ascii="맑은 고딕" w:cs="맑은 고딕" w:eastAsia="맑은 고딕" w:hAnsi="맑은 고딕"/>
+          <w:b/>
+          <w:bCs/>
+          <w:sz w:val="22"/>
+          <w:szCs w:val="22"/>
+        </w:rPr>
+        <w:t xml:space="preserve">시기적으로나 내용적으로 연결</w:t>
+      </w:r>
+      <w:r>
+        <w:rPr>
+          <w:rFonts w:ascii="맑은 고딕" w:cs="맑은 고딕" w:eastAsia="맑은 고딕" w:hAnsi="맑은 고딕"/>
+          <w:sz w:val="22"/>
+          <w:szCs w:val="22"/>
+        </w:rPr>
+        <w:t xml:space="preserve">되어 있는지, 즉 금원 지급(또는 그 약속)과 의견서 서명의 </w:t>
+      </w:r>
+      <w:r>
+        <w:rPr>
+          <w:rFonts w:ascii="맑은 고딕" w:cs="맑은 고딕" w:eastAsia="맑은 고딕" w:hAnsi="맑은 고딕"/>
+          <w:b/>
+          <w:bCs/>
+          <w:sz w:val="22"/>
+          <w:szCs w:val="22"/>
+        </w:rPr>
+        <w:t xml:space="preserve">선후 관계</w:t>
+      </w:r>
+      <w:r>
+        <w:rPr>
+          <w:rFonts w:ascii="맑은 고딕" w:cs="맑은 고딕" w:eastAsia="맑은 고딕" w:hAnsi="맑은 고딕"/>
+          <w:sz w:val="22"/>
+          <w:szCs w:val="22"/>
+        </w:rPr>
+        <w:t xml:space="preserve">를 확인하여 주시기 바랍니다. 이 서명은 순정축협의 인허가 절차에 직접 도움이 되는 행위이므로, 대가 관계를 판단하는 데 중요한 사정입니다.</w:t>
       </w:r>
     </w:p>
     <w:p>
@@ -3527,63 +3691,43 @@
           <w:sz w:val="22"/>
           <w:szCs w:val="22"/>
         </w:rPr>
-        <w:t xml:space="preserve">마. </w:t>
-      </w:r>
-      <w:r>
-        <w:rPr>
-          <w:rFonts w:ascii="맑은 고딕" w:cs="맑은 고딕" w:eastAsia="맑은 고딕" w:hAnsi="맑은 고딕"/>
-          <w:sz w:val="22"/>
-          <w:szCs w:val="22"/>
-        </w:rPr>
-        <w:t xml:space="preserve">진정인은 2026. 10. ____. 위원회에 두 답변서의 작성자, 작성 과정에서의 사전 협의, 작성 비용의 부담 주체를 묻는 내용증명을 보냈으나(증 제10호), [답변 없음 / 다음과 같이 답변함: __________].</w:t>
-      </w:r>
-    </w:p>
-    <w:p>
-      <w:pPr>
-        <w:spacing w:after="120" w:before="0" w:line="380"/>
-        <w:jc w:val="both"/>
-      </w:pPr>
-      <w:r>
-        <w:rPr>
-          <w:rFonts w:ascii="맑은 고딕" w:cs="맑은 고딕" w:eastAsia="맑은 고딕" w:hAnsi="맑은 고딕"/>
-          <w:sz w:val="22"/>
-          <w:szCs w:val="22"/>
-        </w:rPr>
-        <w:t xml:space="preserve">금원을 지급한 쪽과 받은 쪽이 주민의 자료 요구에 대하여 답변 내용을 맞추었다면, 이는 위 4항 나.에서 본 </w:t>
-      </w:r>
-      <w:r>
-        <w:rPr>
-          <w:rFonts w:ascii="맑은 고딕" w:cs="맑은 고딕" w:eastAsia="맑은 고딕" w:hAnsi="맑은 고딕"/>
-          <w:b/>
-          <w:bCs/>
-          <w:sz w:val="22"/>
-          <w:szCs w:val="22"/>
-        </w:rPr>
-        <w:t xml:space="preserve">금원 지급과 협력 약속 사이의 대가 관계</w:t>
-      </w:r>
-      <w:r>
-        <w:rPr>
-          <w:rFonts w:ascii="맑은 고딕" w:cs="맑은 고딕" w:eastAsia="맑은 고딕" w:hAnsi="맑은 고딕"/>
-          <w:sz w:val="22"/>
-          <w:szCs w:val="22"/>
-        </w:rPr>
-        <w:t xml:space="preserve">에 대한 의혹을 더욱 짙게 하는 사정입니다. 아울러 수사 과정에서 관련자들 사이에 진술이나 자료를 맞출 우려가 있으므로, 신속한 자료 확보가 필요합니다.</w:t>
-      </w:r>
-    </w:p>
-    <w:p>
-      <w:pPr>
-        <w:keepNext/>
-        <w:spacing w:after="140" w:before="300"/>
-      </w:pPr>
-      <w:r>
-        <w:rPr>
-          <w:rFonts w:ascii="맑은 고딕" w:cs="맑은 고딕" w:eastAsia="맑은 고딕" w:hAnsi="맑은 고딕"/>
-          <w:b/>
-          <w:bCs/>
-          <w:sz w:val="24"/>
-          <w:szCs w:val="24"/>
-        </w:rPr>
-        <w:t xml:space="preserve">6. 수사 요청 사항</w:t>
+        <w:t xml:space="preserve">바. </w:t>
+      </w:r>
+      <w:r>
+        <w:rPr>
+          <w:rFonts w:ascii="맑은 고딕" w:cs="맑은 고딕" w:eastAsia="맑은 고딕" w:hAnsi="맑은 고딕"/>
+          <w:b/>
+          <w:bCs/>
+          <w:sz w:val="22"/>
+          <w:szCs w:val="22"/>
+        </w:rPr>
+        <w:t xml:space="preserve">이해관계의 일치</w:t>
+      </w:r>
+      <w:r>
+        <w:rPr>
+          <w:rFonts w:ascii="맑은 고딕" w:cs="맑은 고딕" w:eastAsia="맑은 고딕" w:hAnsi="맑은 고딕"/>
+          <w:sz w:val="22"/>
+          <w:szCs w:val="22"/>
+        </w:rPr>
+        <w:t xml:space="preserve">: 위원회 측 7명은 순정축협의 시설 신축에 "반대의견 없음"으로 서명하여 순정축협의 인허가에 협력하였습니다(증 제12호). 순정축협은 위원회에 금원을 지급하였습니다. 두 단체는 이처럼 </w:t>
+      </w:r>
+      <w:r>
+        <w:rPr>
+          <w:rFonts w:ascii="맑은 고딕" w:cs="맑은 고딕" w:eastAsia="맑은 고딕" w:hAnsi="맑은 고딕"/>
+          <w:b/>
+          <w:bCs/>
+          <w:sz w:val="22"/>
+          <w:szCs w:val="22"/>
+        </w:rPr>
+        <w:t xml:space="preserve">서로에게 이익을 준 관계</w:t>
+      </w:r>
+      <w:r>
+        <w:rPr>
+          <w:rFonts w:ascii="맑은 고딕" w:cs="맑은 고딕" w:eastAsia="맑은 고딕" w:hAnsi="맑은 고딕"/>
+          <w:sz w:val="22"/>
+          <w:szCs w:val="22"/>
+        </w:rPr>
+        <w:t xml:space="preserve">에 있으므로, 그 경위에 대한 주민의 질의에 공동으로 대응할 동기가 있습니다.</w:t>
       </w:r>
     </w:p>
     <w:p>
@@ -3600,33 +3744,63 @@
           <w:sz w:val="22"/>
           <w:szCs w:val="22"/>
         </w:rPr>
-        <w:t xml:space="preserve">가. </w:t>
-      </w:r>
-      <w:r>
-        <w:rPr>
-          <w:rFonts w:ascii="맑은 고딕" w:cs="맑은 고딕" w:eastAsia="맑은 고딕" w:hAnsi="맑은 고딕"/>
-          <w:sz w:val="22"/>
-          <w:szCs w:val="22"/>
-        </w:rPr>
-        <w:t xml:space="preserve">순정축협의 위 1억 원 지급 관련 </w:t>
-      </w:r>
-      <w:r>
-        <w:rPr>
-          <w:rFonts w:ascii="맑은 고딕" w:cs="맑은 고딕" w:eastAsia="맑은 고딕" w:hAnsi="맑은 고딕"/>
-          <w:b/>
-          <w:bCs/>
-          <w:sz w:val="22"/>
-          <w:szCs w:val="22"/>
-        </w:rPr>
-        <w:t xml:space="preserve">이사회 의사록, 지급결의서, 회계전표, 예산서</w:t>
-      </w:r>
-      <w:r>
-        <w:rPr>
-          <w:rFonts w:ascii="맑은 고딕" w:cs="맑은 고딕" w:eastAsia="맑은 고딕" w:hAnsi="맑은 고딕"/>
-          <w:sz w:val="22"/>
-          <w:szCs w:val="22"/>
-        </w:rPr>
-        <w:t xml:space="preserve"> 확보</w:t>
+        <w:t xml:space="preserve">사. </w:t>
+      </w:r>
+      <w:r>
+        <w:rPr>
+          <w:rFonts w:ascii="맑은 고딕" w:cs="맑은 고딕" w:eastAsia="맑은 고딕" w:hAnsi="맑은 고딕"/>
+          <w:sz w:val="22"/>
+          <w:szCs w:val="22"/>
+        </w:rPr>
+        <w:t xml:space="preserve">진정인은 2026. 10. ____. 위원회에 두 답변서의 작성자, 작성 과정에서의 사전 협의, 작성 비용의 부담 주체를 묻는 내용증명을 보냈으나(증 제10호), [답변 없음 / 다음과 같이 답변함: __________].</w:t>
+      </w:r>
+    </w:p>
+    <w:p>
+      <w:pPr>
+        <w:spacing w:after="120" w:before="0" w:line="380"/>
+        <w:jc w:val="both"/>
+      </w:pPr>
+      <w:r>
+        <w:rPr>
+          <w:rFonts w:ascii="맑은 고딕" w:cs="맑은 고딕" w:eastAsia="맑은 고딕" w:hAnsi="맑은 고딕"/>
+          <w:sz w:val="22"/>
+          <w:szCs w:val="22"/>
+        </w:rPr>
+        <w:t xml:space="preserve">금원을 지급한 쪽과 받은 쪽이 주민의 자료 요구에 대하여 답변 내용을 맞추었다면, 이는 위 4항 나.에서 본 </w:t>
+      </w:r>
+      <w:r>
+        <w:rPr>
+          <w:rFonts w:ascii="맑은 고딕" w:cs="맑은 고딕" w:eastAsia="맑은 고딕" w:hAnsi="맑은 고딕"/>
+          <w:b/>
+          <w:bCs/>
+          <w:sz w:val="22"/>
+          <w:szCs w:val="22"/>
+        </w:rPr>
+        <w:t xml:space="preserve">금원 지급과 협력 약속 사이의 대가 관계</w:t>
+      </w:r>
+      <w:r>
+        <w:rPr>
+          <w:rFonts w:ascii="맑은 고딕" w:cs="맑은 고딕" w:eastAsia="맑은 고딕" w:hAnsi="맑은 고딕"/>
+          <w:sz w:val="22"/>
+          <w:szCs w:val="22"/>
+        </w:rPr>
+        <w:t xml:space="preserve">에 대한 의혹을 더욱 짙게 하는 사정입니다. 아울러 수사 과정에서 관련자들 사이에 진술이나 자료를 맞출 우려가 있으므로, 신속한 자료 확보가 필요합니다.</w:t>
+      </w:r>
+    </w:p>
+    <w:p>
+      <w:pPr>
+        <w:keepNext/>
+        <w:spacing w:after="140" w:before="300"/>
+      </w:pPr>
+      <w:r>
+        <w:rPr>
+          <w:rFonts w:ascii="맑은 고딕" w:cs="맑은 고딕" w:eastAsia="맑은 고딕" w:hAnsi="맑은 고딕"/>
+          <w:b/>
+          <w:bCs/>
+          <w:sz w:val="24"/>
+          <w:szCs w:val="24"/>
+        </w:rPr>
+        <w:t xml:space="preserve">6. 수사 요청 사항</w:t>
       </w:r>
     </w:p>
     <w:p>
@@ -3643,33 +3817,33 @@
           <w:sz w:val="22"/>
           <w:szCs w:val="22"/>
         </w:rPr>
-        <w:t xml:space="preserve">나. </w:t>
-      </w:r>
-      <w:r>
-        <w:rPr>
-          <w:rFonts w:ascii="맑은 고딕" w:cs="맑은 고딕" w:eastAsia="맑은 고딕" w:hAnsi="맑은 고딕"/>
-          <w:sz w:val="22"/>
-          <w:szCs w:val="22"/>
-        </w:rPr>
-        <w:t xml:space="preserve">위 금원이 입금된 </w:t>
-      </w:r>
-      <w:r>
-        <w:rPr>
-          <w:rFonts w:ascii="맑은 고딕" w:cs="맑은 고딕" w:eastAsia="맑은 고딕" w:hAnsi="맑은 고딕"/>
-          <w:b/>
-          <w:bCs/>
-          <w:sz w:val="22"/>
-          <w:szCs w:val="22"/>
-        </w:rPr>
-        <w:t xml:space="preserve">계좌의 명의인과 입출금 내역</w:t>
-      </w:r>
-      <w:r>
-        <w:rPr>
-          <w:rFonts w:ascii="맑은 고딕" w:cs="맑은 고딕" w:eastAsia="맑은 고딕" w:hAnsi="맑은 고딕"/>
-          <w:sz w:val="22"/>
-          <w:szCs w:val="22"/>
-        </w:rPr>
-        <w:t xml:space="preserve"> 확인</w:t>
+        <w:t xml:space="preserve">가. </w:t>
+      </w:r>
+      <w:r>
+        <w:rPr>
+          <w:rFonts w:ascii="맑은 고딕" w:cs="맑은 고딕" w:eastAsia="맑은 고딕" w:hAnsi="맑은 고딕"/>
+          <w:sz w:val="22"/>
+          <w:szCs w:val="22"/>
+        </w:rPr>
+        <w:t xml:space="preserve">순정축협의 위 1억 원 지급 관련 </w:t>
+      </w:r>
+      <w:r>
+        <w:rPr>
+          <w:rFonts w:ascii="맑은 고딕" w:cs="맑은 고딕" w:eastAsia="맑은 고딕" w:hAnsi="맑은 고딕"/>
+          <w:b/>
+          <w:bCs/>
+          <w:sz w:val="22"/>
+          <w:szCs w:val="22"/>
+        </w:rPr>
+        <w:t xml:space="preserve">이사회 의사록, 지급결의서, 회계전표, 예산서</w:t>
+      </w:r>
+      <w:r>
+        <w:rPr>
+          <w:rFonts w:ascii="맑은 고딕" w:cs="맑은 고딕" w:eastAsia="맑은 고딕" w:hAnsi="맑은 고딕"/>
+          <w:sz w:val="22"/>
+          <w:szCs w:val="22"/>
+        </w:rPr>
+        <w:t xml:space="preserve"> 확보</w:t>
       </w:r>
     </w:p>
     <w:p>
@@ -3686,25 +3860,25 @@
           <w:sz w:val="22"/>
           <w:szCs w:val="22"/>
         </w:rPr>
-        <w:t xml:space="preserve">다. </w:t>
-      </w:r>
-      <w:r>
-        <w:rPr>
-          <w:rFonts w:ascii="맑은 고딕" w:cs="맑은 고딕" w:eastAsia="맑은 고딕" w:hAnsi="맑은 고딕"/>
-          <w:sz w:val="22"/>
-          <w:szCs w:val="22"/>
-        </w:rPr>
-        <w:t xml:space="preserve">위원회의 </w:t>
-      </w:r>
-      <w:r>
-        <w:rPr>
-          <w:rFonts w:ascii="맑은 고딕" w:cs="맑은 고딕" w:eastAsia="맑은 고딕" w:hAnsi="맑은 고딕"/>
-          <w:b/>
-          <w:bCs/>
-          <w:sz w:val="22"/>
-          <w:szCs w:val="22"/>
-        </w:rPr>
-        <w:t xml:space="preserve">회칙, 회의록, 회계장부, 집행 증빙</w:t>
+        <w:t xml:space="preserve">나. </w:t>
+      </w:r>
+      <w:r>
+        <w:rPr>
+          <w:rFonts w:ascii="맑은 고딕" w:cs="맑은 고딕" w:eastAsia="맑은 고딕" w:hAnsi="맑은 고딕"/>
+          <w:sz w:val="22"/>
+          <w:szCs w:val="22"/>
+        </w:rPr>
+        <w:t xml:space="preserve">위 금원이 입금된 </w:t>
+      </w:r>
+      <w:r>
+        <w:rPr>
+          <w:rFonts w:ascii="맑은 고딕" w:cs="맑은 고딕" w:eastAsia="맑은 고딕" w:hAnsi="맑은 고딕"/>
+          <w:b/>
+          <w:bCs/>
+          <w:sz w:val="22"/>
+          <w:szCs w:val="22"/>
+        </w:rPr>
+        <w:t xml:space="preserve">계좌의 명의인과 입출금 내역</w:t>
       </w:r>
       <w:r>
         <w:rPr>
@@ -3729,33 +3903,33 @@
           <w:sz w:val="22"/>
           <w:szCs w:val="22"/>
         </w:rPr>
-        <w:t xml:space="preserve">라. </w:t>
-      </w:r>
-      <w:r>
-        <w:rPr>
-          <w:rFonts w:ascii="맑은 고딕" w:cs="맑은 고딕" w:eastAsia="맑은 고딕" w:hAnsi="맑은 고딕"/>
-          <w:sz w:val="22"/>
-          <w:szCs w:val="22"/>
-        </w:rPr>
-        <w:t xml:space="preserve">송완복이 받을 수 있었다는 "관련 금원"의 </w:t>
-      </w:r>
-      <w:r>
-        <w:rPr>
-          <w:rFonts w:ascii="맑은 고딕" w:cs="맑은 고딕" w:eastAsia="맑은 고딕" w:hAnsi="맑은 고딕"/>
-          <w:b/>
-          <w:bCs/>
-          <w:sz w:val="22"/>
-          <w:szCs w:val="22"/>
-        </w:rPr>
-        <w:t xml:space="preserve">원래 명목과 근거</w:t>
-      </w:r>
-      <w:r>
-        <w:rPr>
-          <w:rFonts w:ascii="맑은 고딕" w:cs="맑은 고딕" w:eastAsia="맑은 고딕" w:hAnsi="맑은 고딕"/>
-          <w:sz w:val="22"/>
-          <w:szCs w:val="22"/>
-        </w:rPr>
-        <w:t xml:space="preserve">, 그리고 순정축협이 이를 위원회에 지급하게 된 경위 확인 (참고인 조사)</w:t>
+        <w:t xml:space="preserve">다. </w:t>
+      </w:r>
+      <w:r>
+        <w:rPr>
+          <w:rFonts w:ascii="맑은 고딕" w:cs="맑은 고딕" w:eastAsia="맑은 고딕" w:hAnsi="맑은 고딕"/>
+          <w:sz w:val="22"/>
+          <w:szCs w:val="22"/>
+        </w:rPr>
+        <w:t xml:space="preserve">위원회의 </w:t>
+      </w:r>
+      <w:r>
+        <w:rPr>
+          <w:rFonts w:ascii="맑은 고딕" w:cs="맑은 고딕" w:eastAsia="맑은 고딕" w:hAnsi="맑은 고딕"/>
+          <w:b/>
+          <w:bCs/>
+          <w:sz w:val="22"/>
+          <w:szCs w:val="22"/>
+        </w:rPr>
+        <w:t xml:space="preserve">회칙, 회의록, 회계장부, 집행 증빙</w:t>
+      </w:r>
+      <w:r>
+        <w:rPr>
+          <w:rFonts w:ascii="맑은 고딕" w:cs="맑은 고딕" w:eastAsia="맑은 고딕" w:hAnsi="맑은 고딕"/>
+          <w:sz w:val="22"/>
+          <w:szCs w:val="22"/>
+        </w:rPr>
+        <w:t xml:space="preserve"> 확인</w:t>
       </w:r>
     </w:p>
     <w:p>
@@ -3772,33 +3946,33 @@
           <w:sz w:val="22"/>
           <w:szCs w:val="22"/>
         </w:rPr>
-        <w:t xml:space="preserve">마. </w:t>
-      </w:r>
-      <w:r>
-        <w:rPr>
-          <w:rFonts w:ascii="맑은 고딕" w:cs="맑은 고딕" w:eastAsia="맑은 고딕" w:hAnsi="맑은 고딕"/>
-          <w:sz w:val="22"/>
-          <w:szCs w:val="22"/>
-        </w:rPr>
-        <w:t xml:space="preserve">2023. 1.경 협약 체결 전후로 위원회 및 이장들과 순정축협 사이에 오간 </w:t>
-      </w:r>
-      <w:r>
-        <w:rPr>
-          <w:rFonts w:ascii="맑은 고딕" w:cs="맑은 고딕" w:eastAsia="맑은 고딕" w:hAnsi="맑은 고딕"/>
-          <w:b/>
-          <w:bCs/>
-          <w:sz w:val="22"/>
-          <w:szCs w:val="22"/>
-        </w:rPr>
-        <w:t xml:space="preserve">금원 지원 약속과 협약 내용의 관련성</w:t>
-      </w:r>
-      <w:r>
-        <w:rPr>
-          <w:rFonts w:ascii="맑은 고딕" w:cs="맑은 고딕" w:eastAsia="맑은 고딕" w:hAnsi="맑은 고딕"/>
-          <w:sz w:val="22"/>
-          <w:szCs w:val="22"/>
-        </w:rPr>
-        <w:t xml:space="preserve"> 확인</w:t>
+        <w:t xml:space="preserve">라. </w:t>
+      </w:r>
+      <w:r>
+        <w:rPr>
+          <w:rFonts w:ascii="맑은 고딕" w:cs="맑은 고딕" w:eastAsia="맑은 고딕" w:hAnsi="맑은 고딕"/>
+          <w:sz w:val="22"/>
+          <w:szCs w:val="22"/>
+        </w:rPr>
+        <w:t xml:space="preserve">송완복이 받을 수 있었다는 "관련 금원"의 </w:t>
+      </w:r>
+      <w:r>
+        <w:rPr>
+          <w:rFonts w:ascii="맑은 고딕" w:cs="맑은 고딕" w:eastAsia="맑은 고딕" w:hAnsi="맑은 고딕"/>
+          <w:b/>
+          <w:bCs/>
+          <w:sz w:val="22"/>
+          <w:szCs w:val="22"/>
+        </w:rPr>
+        <w:t xml:space="preserve">원래 명목과 근거</w:t>
+      </w:r>
+      <w:r>
+        <w:rPr>
+          <w:rFonts w:ascii="맑은 고딕" w:cs="맑은 고딕" w:eastAsia="맑은 고딕" w:hAnsi="맑은 고딕"/>
+          <w:sz w:val="22"/>
+          <w:szCs w:val="22"/>
+        </w:rPr>
+        <w:t xml:space="preserve">, 그리고 순정축협이 이를 위원회에 지급하게 된 경위 확인 (참고인 조사)</w:t>
       </w:r>
     </w:p>
     <w:p>
@@ -3815,69 +3989,33 @@
           <w:sz w:val="22"/>
           <w:szCs w:val="22"/>
         </w:rPr>
-        <w:t xml:space="preserve">바. </w:t>
-      </w:r>
-      <w:r>
-        <w:rPr>
-          <w:rFonts w:ascii="맑은 고딕" w:cs="맑은 고딕" w:eastAsia="맑은 고딕" w:hAnsi="맑은 고딕"/>
-          <w:sz w:val="22"/>
-          <w:szCs w:val="22"/>
-        </w:rPr>
-        <w:t xml:space="preserve">위원회와 순정축협의 2026. 9.자 </w:t>
-      </w:r>
-      <w:r>
-        <w:rPr>
-          <w:rFonts w:ascii="맑은 고딕" w:cs="맑은 고딕" w:eastAsia="맑은 고딕" w:hAnsi="맑은 고딕"/>
-          <w:b/>
-          <w:bCs/>
-          <w:sz w:val="22"/>
-          <w:szCs w:val="22"/>
-        </w:rPr>
-        <w:t xml:space="preserve">답변서 작성자와 작성 경위</w:t>
-      </w:r>
-      <w:r>
-        <w:rPr>
-          <w:rFonts w:ascii="맑은 고딕" w:cs="맑은 고딕" w:eastAsia="맑은 고딕" w:hAnsi="맑은 고딕"/>
-          <w:sz w:val="22"/>
-          <w:szCs w:val="22"/>
-        </w:rPr>
-        <w:t xml:space="preserve">, 두 단체 사이의 </w:t>
-      </w:r>
-      <w:r>
-        <w:rPr>
-          <w:rFonts w:ascii="맑은 고딕" w:cs="맑은 고딕" w:eastAsia="맑은 고딕" w:hAnsi="맑은 고딕"/>
-          <w:b/>
-          <w:bCs/>
-          <w:sz w:val="22"/>
-          <w:szCs w:val="22"/>
-        </w:rPr>
-        <w:t xml:space="preserve">사전 협의 여부</w:t>
-      </w:r>
-      <w:r>
-        <w:rPr>
-          <w:rFonts w:ascii="맑은 고딕" w:cs="맑은 고딕" w:eastAsia="맑은 고딕" w:hAnsi="맑은 고딕"/>
-          <w:sz w:val="22"/>
-          <w:szCs w:val="22"/>
-        </w:rPr>
-        <w:t xml:space="preserve">(연락 내역 포함), 그리고 답변서 작성 비용(법률 자문료 등)의 </w:t>
-      </w:r>
-      <w:r>
-        <w:rPr>
-          <w:rFonts w:ascii="맑은 고딕" w:cs="맑은 고딕" w:eastAsia="맑은 고딕" w:hAnsi="맑은 고딕"/>
-          <w:b/>
-          <w:bCs/>
-          <w:sz w:val="22"/>
-          <w:szCs w:val="22"/>
-        </w:rPr>
-        <w:t xml:space="preserve">부담 주체</w:t>
-      </w:r>
-      <w:r>
-        <w:rPr>
-          <w:rFonts w:ascii="맑은 고딕" w:cs="맑은 고딕" w:eastAsia="맑은 고딕" w:hAnsi="맑은 고딕"/>
-          <w:sz w:val="22"/>
-          <w:szCs w:val="22"/>
-        </w:rPr>
-        <w:t xml:space="preserve">와 그 비용이 위 금원에서 지출되었는지 여부 확인</w:t>
+        <w:t xml:space="preserve">마. </w:t>
+      </w:r>
+      <w:r>
+        <w:rPr>
+          <w:rFonts w:ascii="맑은 고딕" w:cs="맑은 고딕" w:eastAsia="맑은 고딕" w:hAnsi="맑은 고딕"/>
+          <w:sz w:val="22"/>
+          <w:szCs w:val="22"/>
+        </w:rPr>
+        <w:t xml:space="preserve">2023. 1.경 협약 체결 전후로 위원회 및 이장들과 순정축협 사이에 오간 </w:t>
+      </w:r>
+      <w:r>
+        <w:rPr>
+          <w:rFonts w:ascii="맑은 고딕" w:cs="맑은 고딕" w:eastAsia="맑은 고딕" w:hAnsi="맑은 고딕"/>
+          <w:b/>
+          <w:bCs/>
+          <w:sz w:val="22"/>
+          <w:szCs w:val="22"/>
+        </w:rPr>
+        <w:t xml:space="preserve">금원 지원 약속과 협약 내용의 관련성</w:t>
+      </w:r>
+      <w:r>
+        <w:rPr>
+          <w:rFonts w:ascii="맑은 고딕" w:cs="맑은 고딕" w:eastAsia="맑은 고딕" w:hAnsi="맑은 고딕"/>
+          <w:sz w:val="22"/>
+          <w:szCs w:val="22"/>
+        </w:rPr>
+        <w:t xml:space="preserve"> 확인</w:t>
       </w:r>
     </w:p>
     <w:p>
@@ -3894,7 +4032,147 @@
           <w:sz w:val="22"/>
           <w:szCs w:val="22"/>
         </w:rPr>
+        <w:t xml:space="preserve">바. </w:t>
+      </w:r>
+      <w:r>
+        <w:rPr>
+          <w:rFonts w:ascii="맑은 고딕" w:cs="맑은 고딕" w:eastAsia="맑은 고딕" w:hAnsi="맑은 고딕"/>
+          <w:sz w:val="22"/>
+          <w:szCs w:val="22"/>
+        </w:rPr>
+        <w:t xml:space="preserve">위원회와 순정축협의 2026. 9.자 </w:t>
+      </w:r>
+      <w:r>
+        <w:rPr>
+          <w:rFonts w:ascii="맑은 고딕" w:cs="맑은 고딕" w:eastAsia="맑은 고딕" w:hAnsi="맑은 고딕"/>
+          <w:b/>
+          <w:bCs/>
+          <w:sz w:val="22"/>
+          <w:szCs w:val="22"/>
+        </w:rPr>
+        <w:t xml:space="preserve">답변서 작성자와 작성 경위</w:t>
+      </w:r>
+      <w:r>
+        <w:rPr>
+          <w:rFonts w:ascii="맑은 고딕" w:cs="맑은 고딕" w:eastAsia="맑은 고딕" w:hAnsi="맑은 고딕"/>
+          <w:sz w:val="22"/>
+          <w:szCs w:val="22"/>
+        </w:rPr>
+        <w:t xml:space="preserve">, 두 단체 사이의 </w:t>
+      </w:r>
+      <w:r>
+        <w:rPr>
+          <w:rFonts w:ascii="맑은 고딕" w:cs="맑은 고딕" w:eastAsia="맑은 고딕" w:hAnsi="맑은 고딕"/>
+          <w:b/>
+          <w:bCs/>
+          <w:sz w:val="22"/>
+          <w:szCs w:val="22"/>
+        </w:rPr>
+        <w:t xml:space="preserve">사전 협의 여부</w:t>
+      </w:r>
+      <w:r>
+        <w:rPr>
+          <w:rFonts w:ascii="맑은 고딕" w:cs="맑은 고딕" w:eastAsia="맑은 고딕" w:hAnsi="맑은 고딕"/>
+          <w:sz w:val="22"/>
+          <w:szCs w:val="22"/>
+        </w:rPr>
+        <w:t xml:space="preserve">(연락 내역 포함), 그리고 답변서 작성 비용(법률 자문료 등)의 </w:t>
+      </w:r>
+      <w:r>
+        <w:rPr>
+          <w:rFonts w:ascii="맑은 고딕" w:cs="맑은 고딕" w:eastAsia="맑은 고딕" w:hAnsi="맑은 고딕"/>
+          <w:b/>
+          <w:bCs/>
+          <w:sz w:val="22"/>
+          <w:szCs w:val="22"/>
+        </w:rPr>
+        <w:t xml:space="preserve">부담 주체</w:t>
+      </w:r>
+      <w:r>
+        <w:rPr>
+          <w:rFonts w:ascii="맑은 고딕" w:cs="맑은 고딕" w:eastAsia="맑은 고딕" w:hAnsi="맑은 고딕"/>
+          <w:sz w:val="22"/>
+          <w:szCs w:val="22"/>
+        </w:rPr>
+        <w:t xml:space="preserve">와 그 비용이 위 금원에서 지출되었는지 여부 확인</w:t>
+      </w:r>
+    </w:p>
+    <w:p>
+      <w:pPr>
+        <w:spacing w:after="100" w:line="370"/>
+        <w:ind w:left="400" w:hanging="400"/>
+        <w:jc w:val="both"/>
+      </w:pPr>
+      <w:r>
+        <w:rPr>
+          <w:rFonts w:ascii="맑은 고딕" w:cs="맑은 고딕" w:eastAsia="맑은 고딕" w:hAnsi="맑은 고딕"/>
+          <w:b/>
+          <w:bCs/>
+          <w:sz w:val="22"/>
+          <w:szCs w:val="22"/>
+        </w:rPr>
         <w:t xml:space="preserve">사. </w:t>
+      </w:r>
+      <w:r>
+        <w:rPr>
+          <w:rFonts w:ascii="맑은 고딕" w:cs="맑은 고딕" w:eastAsia="맑은 고딕" w:hAnsi="맑은 고딕"/>
+          <w:sz w:val="22"/>
+          <w:szCs w:val="22"/>
+        </w:rPr>
+        <w:t xml:space="preserve">순정축협 시설 신축 관련 </w:t>
+      </w:r>
+      <w:r>
+        <w:rPr>
+          <w:rFonts w:ascii="맑은 고딕" w:cs="맑은 고딕" w:eastAsia="맑은 고딕" w:hAnsi="맑은 고딕"/>
+          <w:b/>
+          <w:bCs/>
+          <w:sz w:val="22"/>
+          <w:szCs w:val="22"/>
+        </w:rPr>
+        <w:t xml:space="preserve">주민의견수렴 서류 일체</w:t>
+      </w:r>
+      <w:r>
+        <w:rPr>
+          <w:rFonts w:ascii="맑은 고딕" w:cs="맑은 고딕" w:eastAsia="맑은 고딕" w:hAnsi="맑은 고딕"/>
+          <w:sz w:val="22"/>
+          <w:szCs w:val="22"/>
+        </w:rPr>
+        <w:t xml:space="preserve">(정읍시 건축 담당 부서의 요청 공문, 감곡면장의 회신 공문, 서명부)를 확보하여, 위원회 측 7명의 서명 일자와 위 금원의 </w:t>
+      </w:r>
+      <w:r>
+        <w:rPr>
+          <w:rFonts w:ascii="맑은 고딕" w:cs="맑은 고딕" w:eastAsia="맑은 고딕" w:hAnsi="맑은 고딕"/>
+          <w:b/>
+          <w:bCs/>
+          <w:sz w:val="22"/>
+          <w:szCs w:val="22"/>
+        </w:rPr>
+        <w:t xml:space="preserve">지급 약속 및 지급 일자의 선후 관계</w:t>
+      </w:r>
+      <w:r>
+        <w:rPr>
+          <w:rFonts w:ascii="맑은 고딕" w:cs="맑은 고딕" w:eastAsia="맑은 고딕" w:hAnsi="맑은 고딕"/>
+          <w:sz w:val="22"/>
+          <w:szCs w:val="22"/>
+        </w:rPr>
+        <w:t xml:space="preserve"> 확인</w:t>
+      </w:r>
+    </w:p>
+    <w:p>
+      <w:pPr>
+        <w:spacing w:after="100" w:line="370"/>
+        <w:ind w:left="400" w:hanging="400"/>
+        <w:jc w:val="both"/>
+      </w:pPr>
+      <w:r>
+        <w:rPr>
+          <w:rFonts w:ascii="맑은 고딕" w:cs="맑은 고딕" w:eastAsia="맑은 고딕" w:hAnsi="맑은 고딕"/>
+          <w:b/>
+          <w:bCs/>
+          <w:sz w:val="22"/>
+          <w:szCs w:val="22"/>
+        </w:rPr>
+        <w:t xml:space="preserve">아. </w:t>
       </w:r>
       <w:r>
         <w:rPr>
@@ -5263,6 +5541,114 @@
                 <w:szCs w:val="20"/>
               </w:rPr>
               <w:t xml:space="preserve">원본 대조 사본</w:t>
+            </w:r>
+          </w:p>
+        </w:tc>
+      </w:tr>
+      <w:tr>
+        <w:trPr>
+          <w:cantSplit/>
+          <w:tblHeader w:val="off"/>
+        </w:trPr>
+        <w:tc>
+          <w:tcPr>
+            <w:tcW w:type="dxa" w:w="1200"/>
+            <w:tcBorders>
+              <w:top w:val="single" w:color="808080" w:sz="4"/>
+              <w:left w:val="single" w:color="808080" w:sz="4"/>
+              <w:bottom w:val="single" w:color="808080" w:sz="4"/>
+              <w:right w:val="single" w:color="808080" w:sz="4"/>
+            </w:tcBorders>
+            <w:tcMar>
+              <w:top w:type="dxa" w:w="80"/>
+              <w:left w:type="dxa" w:w="110"/>
+              <w:bottom w:type="dxa" w:w="80"/>
+              <w:right w:type="dxa" w:w="110"/>
+            </w:tcMar>
+            <w:vAlign w:val="center"/>
+          </w:tcPr>
+          <w:p>
+            <w:pPr>
+              <w:spacing w:line="320"/>
+              <w:jc w:val="left"/>
+            </w:pPr>
+            <w:r>
+              <w:rPr>
+                <w:rFonts w:ascii="맑은 고딕" w:cs="맑은 고딕" w:eastAsia="맑은 고딕" w:hAnsi="맑은 고딕"/>
+                <w:b w:val="false"/>
+                <w:bCs w:val="false"/>
+                <w:sz w:val="20"/>
+                <w:szCs w:val="20"/>
+              </w:rPr>
+              <w:t xml:space="preserve">증 제12호</w:t>
+            </w:r>
+          </w:p>
+        </w:tc>
+        <w:tc>
+          <w:tcPr>
+            <w:tcW w:type="dxa" w:w="6038"/>
+            <w:tcBorders>
+              <w:top w:val="single" w:color="808080" w:sz="4"/>
+              <w:left w:val="single" w:color="808080" w:sz="4"/>
+              <w:bottom w:val="single" w:color="808080" w:sz="4"/>
+              <w:right w:val="single" w:color="808080" w:sz="4"/>
+            </w:tcBorders>
+            <w:tcMar>
+              <w:top w:type="dxa" w:w="80"/>
+              <w:left w:type="dxa" w:w="110"/>
+              <w:bottom w:type="dxa" w:w="80"/>
+              <w:right w:type="dxa" w:w="110"/>
+            </w:tcMar>
+            <w:vAlign w:val="center"/>
+          </w:tcPr>
+          <w:p>
+            <w:pPr>
+              <w:spacing w:line="320"/>
+              <w:jc w:val="left"/>
+            </w:pPr>
+            <w:r>
+              <w:rPr>
+                <w:rFonts w:ascii="맑은 고딕" w:cs="맑은 고딕" w:eastAsia="맑은 고딕" w:hAnsi="맑은 고딕"/>
+                <w:b w:val="false"/>
+                <w:bCs w:val="false"/>
+                <w:sz w:val="20"/>
+                <w:szCs w:val="20"/>
+              </w:rPr>
+              <w:t xml:space="preserve">감곡면장의 주민의견수렴 결과 회신 공문 [20__. __. __., 문서번호 ______] 및 위원회 측 7명이 "반대의견 없음"에 서명한 의견서</w:t>
+            </w:r>
+          </w:p>
+        </w:tc>
+        <w:tc>
+          <w:tcPr>
+            <w:tcW w:type="dxa" w:w="2400"/>
+            <w:tcBorders>
+              <w:top w:val="single" w:color="808080" w:sz="4"/>
+              <w:left w:val="single" w:color="808080" w:sz="4"/>
+              <w:bottom w:val="single" w:color="808080" w:sz="4"/>
+              <w:right w:val="single" w:color="808080" w:sz="4"/>
+            </w:tcBorders>
+            <w:tcMar>
+              <w:top w:type="dxa" w:w="80"/>
+              <w:left w:type="dxa" w:w="110"/>
+              <w:bottom w:type="dxa" w:w="80"/>
+              <w:right w:type="dxa" w:w="110"/>
+            </w:tcMar>
+            <w:vAlign w:val="center"/>
+          </w:tcPr>
+          <w:p>
+            <w:pPr>
+              <w:spacing w:line="320"/>
+              <w:jc w:val="left"/>
+            </w:pPr>
+            <w:r>
+              <w:rPr>
+                <w:rFonts w:ascii="맑은 고딕" w:cs="맑은 고딕" w:eastAsia="맑은 고딕" w:hAnsi="맑은 고딕"/>
+                <w:b w:val="false"/>
+                <w:bCs w:val="false"/>
+                <w:sz w:val="20"/>
+                <w:szCs w:val="20"/>
+              </w:rPr>
+              <w:t xml:space="preserve">사본 (정보공개청구로 확보)</w:t>
             </w:r>
           </w:p>
         </w:tc>

</xml_diff>